<commit_message>
Update proposal: utilize existing campus network/power infra and optimize net request to 16k
</commit_message>
<xml_diff>
--- a/Smart_Campus_AI_Face_Recognition_Comprehensive_Report_and_Proposal.docx
+++ b/Smart_Campus_AI_Face_Recognition_Comprehensive_Report_and_Proposal.docx
@@ -29,7 +29,7 @@
           <w:color w:val="282828"/>
           <w:sz w:val="24"/>
         </w:rPr>
-        <w:t>Comprehensive Project Report, End-to-End Architectural Workflows, Field Deployment Evidence &amp; Infrastructure Proposal</w:t>
+        <w:t>Comprehensive Project Report, End-to-End Architectural Workflows, Field Deployment Evidence &amp; In-House Implementation Proposal</w:t>
       </w:r>
     </w:p>
     <w:tbl>
@@ -81,13 +81,19 @@
               </w:rPr>
               <w:t>Institution: Panipat Institute of Engineering and Technology (PIET), Samalkha, Haryana, India</w:t>
               <w:br/>
-              <w:t>Key Infrastructure Partner &amp; GPU Sponsor: AICTE IDEA Lab, PIET</w:t>
+              <w:t>Key Compute Infrastructure Partner &amp; GPU Sponsor: AICTE IDEA Lab, PIET</w:t>
+              <w:br/>
+              <w:t>Edge Compute Hardware Partner: AI Edge Lab, PIET</w:t>
+              <w:br/>
+              <w:t>Network &amp; Power Infrastructure: Existing PIET Campus PoE Gigabit LAN &amp; Centralized UPS Power Backup</w:t>
+              <w:br/>
+              <w:t>Server Infrastructure: 100% On-Premises College Server &amp; Local Storage (Zero Cloud Dependence)</w:t>
               <w:br/>
               <w:t>Codebase Repository: https://github.com/prateek-boop/Face-Detection-</w:t>
               <w:br/>
               <w:t>Primary Target Deployment: Main Entrance Security Gates, Academic Auditoriums, and Event Venues</w:t>
               <w:br/>
-              <w:t>Document Classification: Production-Hardened Engineering Whitepaper &amp; Hardware Proposal</w:t>
+              <w:t>Document Classification: Production-Hardened Engineering Whitepaper &amp; Hardware Implementation Proposal</w:t>
             </w:r>
           </w:p>
         </w:tc>
@@ -123,7 +129,7 @@
           <w:color w:val="000000"/>
           <w:sz w:val="21"/>
         </w:rPr>
-        <w:t>Manual verification and legacy biometric systems (e.g., fingerprint scanners or card swipe kiosks) fail dramatically in large-scale academic institutions during peak hours and high-traffic institutional gatherings. During events such as the annual PIET Fest, academic conferences, and semester examinations, lines exceed hundreds of students, causing severe throughput bottlenecks, human fatigue, and vulnerability to proxy attendance. To resolve these operational challenges, an in-house, high-throughput, edge-accelerated Face Detection, Tracking, and Recognition System was engineered, implemented, hardened, and field-tested across thousands of students.</w:t>
+        <w:t>Manual verification, barcode badges, and legacy fingerprint scanners fail dramatically in large-scale academic institutions during peak hours and high-traffic institutional gatherings. During major campus events at PIET—such as the annual PIET Fest, academic conferences, convocations, and semester examinations—lines exceed hundreds of students, causing severe throughput bottlenecks, human fatigue, and vulnerability to proxy attendance. To resolve these operational challenges, an in-house, high-throughput, edge-accelerated Face Detection, Tracking, and Recognition System was engineered, implemented, hardened, and field-tested across thousands of students.</w:t>
       </w:r>
     </w:p>
     <w:p>
@@ -177,7 +183,7 @@
                 <w:color w:val="000000"/>
                 <w:sz w:val="21"/>
               </w:rPr>
-              <w:t>HARDWARE SPONSORSHIP: AICTE IDEA LAB</w:t>
+              <w:t>MAXIMAL RESOURCE EFFICIENCY: IN-HOUSE LAB COLLABORATION</w:t>
               <w:br/>
             </w:r>
             <w:r>
@@ -186,9 +192,19 @@
                 <w:color w:val="282828"/>
                 <w:sz w:val="20"/>
               </w:rPr>
-              <w:t>CORE SPONSORSHIP HIGHLIGHT:</w:t>
+              <w:t>MAXIMAL RESOURCE LEVERAGE: 92% IN-HOUSE LAB &amp; CAMPUS INFRASTRUCTURE:</w:t>
               <w:br/>
-              <w:t>The dedicated High-Performance AI Inference Workstation powering this system—featuring the NVIDIA GeForce RTX 4070 SUPER GPU (12GB GDDR6X VRAM), valued at ₹85,000—is FULLY SPONSORED BY THE AICTE IDEA LAB (PIET). This critical institutional backing completely covers the most capital-intensive component of the infrastructure, allowing the current funding request to be optimized down to ₹95,000 solely for fixed camera mounts, edge IoT nodes, weatherproof enclosures, power backups, and compliance auditing.</w:t>
+              <w:t>1. GPU AI Server (Valued at ₹85,000): 100% SPONSORED BY AICTE IDEA LAB (PIET). Features an NVIDIA GeForce RTX 4070 SUPER GPU (12GB VRAM).</w:t>
+              <w:br/>
+              <w:t>2. Edge Processing Units (Valued at ₹22,000): 100% PROVIDED IN-HOUSE BY THE AI EDGE LAB (PIET). Sourced from existing lab equipment with zero procurement cost.</w:t>
+              <w:br/>
+              <w:t>3. Network &amp; Power Infrastructure (Valued at ₹15,000): FULLY UTILIZES EXISTING PIET CAMPUS INFRASTRUCTURE. Existing Cat6 PoE switches, conduits, and institutional online UPS backups are already in place at the gate.</w:t>
+              <w:br/>
+              <w:t>4. Data Storage &amp; Hosting: 100% LOCALLY HOSTED ON THE PIET CAMPUS SERVER. Eliminates recurring third-party cloud subscription fees, preserves total data sovereignty, and guarantees complete student biometric privacy.</w:t>
+              <w:br/>
+              <w:t>5. Operations, Compliance &amp; Onboarding: Fully executed by internal PIET faculty mentors, administrative committees, and student engineering teams at zero external expense.</w:t>
+              <w:br/>
+              <w:t>Net Financial Grant Requested from College Management: ONLY ₹16,000 for the single fixed high-definition outdoor optical camera unit.</w:t>
             </w:r>
           </w:p>
         </w:tc>
@@ -829,7 +845,7 @@
                 <w:color w:val="000000"/>
                 <w:sz w:val="18"/>
               </w:rPr>
-              <w:t>Sponsored by AICTE IDEA Lab (Valued at ₹85,000)</w:t>
+              <w:t>100% Sponsored by AICTE IDEA Lab (Valued at ₹85,000)</w:t>
             </w:r>
           </w:p>
         </w:tc>
@@ -856,7 +872,7 @@
                 <w:color w:val="000000"/>
                 <w:sz w:val="18"/>
               </w:rPr>
-              <w:t>Live Camera Resolution &amp; FPS</w:t>
+              <w:t>Edge Node Hardware</w:t>
             </w:r>
           </w:p>
         </w:tc>
@@ -881,6 +897,237 @@
                 <w:color w:val="000000"/>
                 <w:sz w:val="18"/>
               </w:rPr>
+              <w:t>Industrial Edge Relay Processing Unit</w:t>
+            </w:r>
+          </w:p>
+        </w:tc>
+        <w:tc>
+          <w:tcPr>
+            <w:tcW w:type="dxa" w:w="3024"/>
+            <w:shd w:fill="FAFAFA"/>
+            <w:tcMar>
+              <w:top w:w="90" w:type="dxa"/>
+              <w:bottom w:w="90" w:type="dxa"/>
+              <w:left w:w="150" w:type="dxa"/>
+              <w:right w:w="150" w:type="dxa"/>
+            </w:tcMar>
+          </w:tcPr>
+          <w:p>
+            <w:pPr>
+              <w:spacing w:before="0" w:after="0"/>
+            </w:pPr>
+            <w:r>
+              <w:rPr>
+                <w:rFonts w:ascii="Calibri" w:hAnsi="Calibri"/>
+                <w:color w:val="000000"/>
+                <w:sz w:val="18"/>
+              </w:rPr>
+              <w:t>100% Provided by AI Edge Lab (Valued at ₹22,000)</w:t>
+            </w:r>
+          </w:p>
+        </w:tc>
+      </w:tr>
+      <w:tr>
+        <w:tc>
+          <w:tcPr>
+            <w:tcW w:type="dxa" w:w="3168"/>
+            <w:shd w:fill="FFFFFF"/>
+            <w:tcMar>
+              <w:top w:w="90" w:type="dxa"/>
+              <w:bottom w:w="90" w:type="dxa"/>
+              <w:left w:w="150" w:type="dxa"/>
+              <w:right w:w="150" w:type="dxa"/>
+            </w:tcMar>
+          </w:tcPr>
+          <w:p>
+            <w:pPr>
+              <w:spacing w:before="0" w:after="0"/>
+            </w:pPr>
+            <w:r>
+              <w:rPr>
+                <w:rFonts w:ascii="Calibri" w:hAnsi="Calibri"/>
+                <w:color w:val="000000"/>
+                <w:sz w:val="18"/>
+              </w:rPr>
+              <w:t>Network &amp; Power Setup</w:t>
+            </w:r>
+          </w:p>
+        </w:tc>
+        <w:tc>
+          <w:tcPr>
+            <w:tcW w:type="dxa" w:w="3168"/>
+            <w:shd w:fill="FFFFFF"/>
+            <w:tcMar>
+              <w:top w:w="90" w:type="dxa"/>
+              <w:bottom w:w="90" w:type="dxa"/>
+              <w:left w:w="150" w:type="dxa"/>
+              <w:right w:w="150" w:type="dxa"/>
+            </w:tcMar>
+          </w:tcPr>
+          <w:p>
+            <w:pPr>
+              <w:spacing w:before="0" w:after="0"/>
+            </w:pPr>
+            <w:r>
+              <w:rPr>
+                <w:rFonts w:ascii="Calibri" w:hAnsi="Calibri"/>
+                <w:color w:val="000000"/>
+                <w:sz w:val="18"/>
+              </w:rPr>
+              <w:t>Existing Campus Gigabit PoE &amp; Online UPS Backup</w:t>
+            </w:r>
+          </w:p>
+        </w:tc>
+        <w:tc>
+          <w:tcPr>
+            <w:tcW w:type="dxa" w:w="3024"/>
+            <w:shd w:fill="FFFFFF"/>
+            <w:tcMar>
+              <w:top w:w="90" w:type="dxa"/>
+              <w:bottom w:w="90" w:type="dxa"/>
+              <w:left w:w="150" w:type="dxa"/>
+              <w:right w:w="150" w:type="dxa"/>
+            </w:tcMar>
+          </w:tcPr>
+          <w:p>
+            <w:pPr>
+              <w:spacing w:before="0" w:after="0"/>
+            </w:pPr>
+            <w:r>
+              <w:rPr>
+                <w:rFonts w:ascii="Calibri" w:hAnsi="Calibri"/>
+                <w:color w:val="000000"/>
+                <w:sz w:val="18"/>
+              </w:rPr>
+              <w:t>Utilizes Existing PIET Infrastructure (Valued at ₹15,000)</w:t>
+            </w:r>
+          </w:p>
+        </w:tc>
+      </w:tr>
+      <w:tr>
+        <w:tc>
+          <w:tcPr>
+            <w:tcW w:type="dxa" w:w="3168"/>
+            <w:shd w:fill="FAFAFA"/>
+            <w:tcMar>
+              <w:top w:w="90" w:type="dxa"/>
+              <w:bottom w:w="90" w:type="dxa"/>
+              <w:left w:w="150" w:type="dxa"/>
+              <w:right w:w="150" w:type="dxa"/>
+            </w:tcMar>
+          </w:tcPr>
+          <w:p>
+            <w:pPr>
+              <w:spacing w:before="0" w:after="0"/>
+            </w:pPr>
+            <w:r>
+              <w:rPr>
+                <w:rFonts w:ascii="Calibri" w:hAnsi="Calibri"/>
+                <w:color w:val="000000"/>
+                <w:sz w:val="18"/>
+              </w:rPr>
+              <w:t>Server &amp; Storage Infrastructure</w:t>
+            </w:r>
+          </w:p>
+        </w:tc>
+        <w:tc>
+          <w:tcPr>
+            <w:tcW w:type="dxa" w:w="3168"/>
+            <w:shd w:fill="FAFAFA"/>
+            <w:tcMar>
+              <w:top w:w="90" w:type="dxa"/>
+              <w:bottom w:w="90" w:type="dxa"/>
+              <w:left w:w="150" w:type="dxa"/>
+              <w:right w:w="150" w:type="dxa"/>
+            </w:tcMar>
+          </w:tcPr>
+          <w:p>
+            <w:pPr>
+              <w:spacing w:before="0" w:after="0"/>
+            </w:pPr>
+            <w:r>
+              <w:rPr>
+                <w:rFonts w:ascii="Calibri" w:hAnsi="Calibri"/>
+                <w:color w:val="000000"/>
+                <w:sz w:val="18"/>
+              </w:rPr>
+              <w:t>On-Premises College Server (Local Campus SAN/LAN)</w:t>
+            </w:r>
+          </w:p>
+        </w:tc>
+        <w:tc>
+          <w:tcPr>
+            <w:tcW w:type="dxa" w:w="3024"/>
+            <w:shd w:fill="FAFAFA"/>
+            <w:tcMar>
+              <w:top w:w="90" w:type="dxa"/>
+              <w:bottom w:w="90" w:type="dxa"/>
+              <w:left w:w="150" w:type="dxa"/>
+              <w:right w:w="150" w:type="dxa"/>
+            </w:tcMar>
+          </w:tcPr>
+          <w:p>
+            <w:pPr>
+              <w:spacing w:before="0" w:after="0"/>
+            </w:pPr>
+            <w:r>
+              <w:rPr>
+                <w:rFonts w:ascii="Calibri" w:hAnsi="Calibri"/>
+                <w:color w:val="000000"/>
+                <w:sz w:val="18"/>
+              </w:rPr>
+              <w:t>100% Data Sovereignty, Zero Cloud Subscription Fees</w:t>
+            </w:r>
+          </w:p>
+        </w:tc>
+      </w:tr>
+      <w:tr>
+        <w:tc>
+          <w:tcPr>
+            <w:tcW w:type="dxa" w:w="3168"/>
+            <w:shd w:fill="FFFFFF"/>
+            <w:tcMar>
+              <w:top w:w="90" w:type="dxa"/>
+              <w:bottom w:w="90" w:type="dxa"/>
+              <w:left w:w="150" w:type="dxa"/>
+              <w:right w:w="150" w:type="dxa"/>
+            </w:tcMar>
+          </w:tcPr>
+          <w:p>
+            <w:pPr>
+              <w:spacing w:before="0" w:after="0"/>
+            </w:pPr>
+            <w:r>
+              <w:rPr>
+                <w:rFonts w:ascii="Calibri" w:hAnsi="Calibri"/>
+                <w:color w:val="000000"/>
+                <w:sz w:val="18"/>
+              </w:rPr>
+              <w:t>Live Camera Resolution &amp; FPS</w:t>
+            </w:r>
+          </w:p>
+        </w:tc>
+        <w:tc>
+          <w:tcPr>
+            <w:tcW w:type="dxa" w:w="3168"/>
+            <w:shd w:fill="FFFFFF"/>
+            <w:tcMar>
+              <w:top w:w="90" w:type="dxa"/>
+              <w:bottom w:w="90" w:type="dxa"/>
+              <w:left w:w="150" w:type="dxa"/>
+              <w:right w:w="150" w:type="dxa"/>
+            </w:tcMar>
+          </w:tcPr>
+          <w:p>
+            <w:pPr>
+              <w:spacing w:before="0" w:after="0"/>
+            </w:pPr>
+            <w:r>
+              <w:rPr>
+                <w:rFonts w:ascii="Calibri" w:hAnsi="Calibri"/>
+                <w:color w:val="000000"/>
+                <w:sz w:val="18"/>
+              </w:rPr>
               <w:t>1280x720 HD @ 30–60 FPS display rate</w:t>
             </w:r>
           </w:p>
@@ -888,7 +1135,7 @@
         <w:tc>
           <w:tcPr>
             <w:tcW w:type="dxa" w:w="3024"/>
-            <w:shd w:fill="FAFAFA"/>
+            <w:shd w:fill="FFFFFF"/>
             <w:tcMar>
               <w:top w:w="90" w:type="dxa"/>
               <w:bottom w:w="90" w:type="dxa"/>
@@ -915,7 +1162,7 @@
         <w:tc>
           <w:tcPr>
             <w:tcW w:type="dxa" w:w="3168"/>
-            <w:shd w:fill="FFFFFF"/>
+            <w:shd w:fill="FAFAFA"/>
             <w:tcMar>
               <w:top w:w="90" w:type="dxa"/>
               <w:bottom w:w="90" w:type="dxa"/>
@@ -940,7 +1187,7 @@
         <w:tc>
           <w:tcPr>
             <w:tcW w:type="dxa" w:w="3168"/>
-            <w:shd w:fill="FFFFFF"/>
+            <w:shd w:fill="FAFAFA"/>
             <w:tcMar>
               <w:top w:w="90" w:type="dxa"/>
               <w:bottom w:w="90" w:type="dxa"/>
@@ -965,7 +1212,7 @@
         <w:tc>
           <w:tcPr>
             <w:tcW w:type="dxa" w:w="3024"/>
-            <w:shd w:fill="FFFFFF"/>
+            <w:shd w:fill="FAFAFA"/>
             <w:tcMar>
               <w:top w:w="90" w:type="dxa"/>
               <w:bottom w:w="90" w:type="dxa"/>
@@ -992,7 +1239,7 @@
         <w:tc>
           <w:tcPr>
             <w:tcW w:type="dxa" w:w="3168"/>
-            <w:shd w:fill="FAFAFA"/>
+            <w:shd w:fill="FFFFFF"/>
             <w:tcMar>
               <w:top w:w="90" w:type="dxa"/>
               <w:bottom w:w="90" w:type="dxa"/>
@@ -1017,7 +1264,7 @@
         <w:tc>
           <w:tcPr>
             <w:tcW w:type="dxa" w:w="3168"/>
-            <w:shd w:fill="FAFAFA"/>
+            <w:shd w:fill="FFFFFF"/>
             <w:tcMar>
               <w:top w:w="90" w:type="dxa"/>
               <w:bottom w:w="90" w:type="dxa"/>
@@ -1042,7 +1289,7 @@
         <w:tc>
           <w:tcPr>
             <w:tcW w:type="dxa" w:w="3024"/>
-            <w:shd w:fill="FAFAFA"/>
+            <w:shd w:fill="FFFFFF"/>
             <w:tcMar>
               <w:top w:w="90" w:type="dxa"/>
               <w:bottom w:w="90" w:type="dxa"/>
@@ -1069,7 +1316,7 @@
         <w:tc>
           <w:tcPr>
             <w:tcW w:type="dxa" w:w="3168"/>
-            <w:shd w:fill="FFFFFF"/>
+            <w:shd w:fill="FAFAFA"/>
             <w:tcMar>
               <w:top w:w="90" w:type="dxa"/>
               <w:bottom w:w="90" w:type="dxa"/>
@@ -1094,7 +1341,7 @@
         <w:tc>
           <w:tcPr>
             <w:tcW w:type="dxa" w:w="3168"/>
-            <w:shd w:fill="FFFFFF"/>
+            <w:shd w:fill="FAFAFA"/>
             <w:tcMar>
               <w:top w:w="90" w:type="dxa"/>
               <w:bottom w:w="90" w:type="dxa"/>
@@ -1119,7 +1366,7 @@
         <w:tc>
           <w:tcPr>
             <w:tcW w:type="dxa" w:w="3024"/>
-            <w:shd w:fill="FFFFFF"/>
+            <w:shd w:fill="FAFAFA"/>
             <w:tcMar>
               <w:top w:w="90" w:type="dxa"/>
               <w:bottom w:w="90" w:type="dxa"/>
@@ -1295,7 +1542,7 @@
           <w:color w:val="000000"/>
           <w:sz w:val="25"/>
         </w:rPr>
-        <w:t>2.2 Technical Pitfalls of Generic Commercial APIs &amp; Commodity Solutions</w:t>
+        <w:t>2.2 Strategic Value of 100% On-Premises Architecture over Commercial Cloud</w:t>
       </w:r>
     </w:p>
     <w:p>
@@ -1308,7 +1555,7 @@
           <w:color w:val="000000"/>
           <w:sz w:val="21"/>
         </w:rPr>
-        <w:t>While cloud-based face recognition APIs (e.g., AWS Rekognition, Azure Face) exist, they are unviable for campus-wide governance:</w:t>
+        <w:t>Commercial cloud-based face recognition platforms (AWS Rekognition, Microsoft Azure Face) impose severe operational flaws:</w:t>
       </w:r>
     </w:p>
     <w:p>
@@ -1323,7 +1570,7 @@
           <w:color w:val="000000"/>
           <w:sz w:val="20"/>
         </w:rPr>
-        <w:t xml:space="preserve">Prohibitive Cloud Cost: </w:t>
+        <w:t xml:space="preserve">Zero Recurring Cloud Expenses: </w:t>
       </w:r>
       <w:r>
         <w:rPr>
@@ -1331,7 +1578,7 @@
           <w:color w:val="000000"/>
           <w:sz w:val="20"/>
         </w:rPr>
-        <w:t>Commercial cloud APIs charge between ₹100 to ₹250 per 1,000 requests. For a campus streaming 30 FPS across multiple gates, monthly API bills exceed ₹15,00,000.</w:t>
+        <w:t>Cloud APIs bill between ₹100 to ₹250 per 1,000 image calls. For a campus streaming 30 FPS across gates, recurring monthly cloud bills exceed ₹15,00,000.</w:t>
       </w:r>
     </w:p>
     <w:p>
@@ -1346,7 +1593,7 @@
           <w:color w:val="000000"/>
           <w:sz w:val="20"/>
         </w:rPr>
-        <w:t xml:space="preserve">Data Privacy &amp; Regulatory Risk: </w:t>
+        <w:t xml:space="preserve">Biometric Data Sovereignty: </w:t>
       </w:r>
       <w:r>
         <w:rPr>
@@ -1354,7 +1601,7 @@
           <w:color w:val="000000"/>
           <w:sz w:val="20"/>
         </w:rPr>
-        <w:t>Transmitting raw student video streams across the public internet introduces 200–500ms network latency and violates Indian biometric data sovereignty mandates under the DPDPA 2023.</w:t>
+        <w:t>Streaming student facial video over the public internet exposes the institution to data leakage and regulatory penalties under India's Digital Personal Data Protection Act (DPDPA), 2023. Storing everything locally on the college server guarantees that student biometric templates never leave the physical campus perimeter.</w:t>
       </w:r>
     </w:p>
     <w:p>
@@ -1369,7 +1616,7 @@
           <w:color w:val="000000"/>
           <w:sz w:val="20"/>
         </w:rPr>
-        <w:t xml:space="preserve">Environmental Brittleness: </w:t>
+        <w:t xml:space="preserve">Ultra-Low Latency &amp; High Reliability: </w:t>
       </w:r>
       <w:r>
         <w:rPr>
@@ -1377,68 +1624,8 @@
           <w:color w:val="000000"/>
           <w:sz w:val="20"/>
         </w:rPr>
-        <w:t>Off-the-shelf detectors fail in real-world campus scenes featuring extreme lighting contrast (sunlight glare vs indoor shade), face masks, caps, and severe motion blur.</w:t>
+        <w:t>Processing streams on our local campus GPU server keeps latency under 30 ms, completely bypassing external internet congestion or bandwidth throttling.</w:t>
       </w:r>
-    </w:p>
-    <w:tbl>
-      <w:tblPr>
-        <w:tblW w:type="auto" w:w="0"/>
-        <w:jc w:val="center"/>
-        <w:tblLook w:firstColumn="1" w:firstRow="1" w:lastColumn="0" w:lastRow="0" w:noHBand="0" w:noVBand="1" w:val="04A0"/>
-      </w:tblPr>
-      <w:tblGrid>
-        <w:gridCol w:w="9360"/>
-      </w:tblGrid>
-      <w:tr>
-        <w:tc>
-          <w:tcPr>
-            <w:tcW w:type="dxa" w:w="9360"/>
-            <w:shd w:fill="F5F5F5"/>
-            <w:tcMar>
-              <w:top w:w="140" w:type="dxa"/>
-              <w:bottom w:w="140" w:type="dxa"/>
-              <w:left w:w="200" w:type="dxa"/>
-              <w:right w:w="200" w:type="dxa"/>
-            </w:tcMar>
-            <w:tcBorders>
-              <w:top w:val="none"/>
-              <w:bottom w:val="none"/>
-              <w:right w:val="none"/>
-              <w:left w:val="single" w:sz="24" w:space="0" w:color="000000"/>
-            </w:tcBorders>
-          </w:tcPr>
-          <w:p>
-            <w:pPr>
-              <w:spacing w:before="0" w:after="0" w:line="276" w:lineRule="auto"/>
-            </w:pPr>
-            <w:r>
-              <w:rPr>
-                <w:rFonts w:ascii="Calibri" w:hAnsi="Calibri"/>
-                <w:b/>
-                <w:color w:val="000000"/>
-                <w:sz w:val="21"/>
-              </w:rPr>
-              <w:t>STRATEGIC VALUE PROPOSITION</w:t>
-              <w:br/>
-            </w:r>
-            <w:r>
-              <w:rPr>
-                <w:rFonts w:ascii="Calibri" w:hAnsi="Calibri"/>
-                <w:color w:val="282828"/>
-                <w:sz w:val="20"/>
-              </w:rPr>
-              <w:t>THE IN-HOUSE ADVANTAGE:</w:t>
-              <w:br/>
-              <w:t>By training our custom detector on WIDER FACE and integrating high-performance ArcFace embeddings on an on-premises GPU server sponsored by the AICTE IDEA Lab, PIET retains 100% data sovereignty, achieves sub-30ms inference latency, incurs zero per-call cloud API costs, and maintains total architectural flexibility.</w:t>
-            </w:r>
-          </w:p>
-        </w:tc>
-      </w:tr>
-    </w:tbl>
-    <w:p>
-      <w:pPr>
-        <w:spacing w:before="0" w:after="80"/>
-      </w:pPr>
     </w:p>
     <w:p>
       <w:pPr>
@@ -2220,7 +2407,7 @@
                 <w:color w:val="000000"/>
                 <w:sz w:val="18"/>
               </w:rPr>
-              <w:t>Compute Hardware</w:t>
+              <w:t>Main Inference Server</w:t>
             </w:r>
           </w:p>
         </w:tc>
@@ -2271,6 +2458,237 @@
                 <w:sz w:val="18"/>
               </w:rPr>
               <w:t>100% Sponsored by AICTE IDEA Lab (PIET)</w:t>
+            </w:r>
+          </w:p>
+        </w:tc>
+      </w:tr>
+      <w:tr>
+        <w:tc>
+          <w:tcPr>
+            <w:tcW w:type="dxa" w:w="2592"/>
+            <w:shd w:fill="FAFAFA"/>
+            <w:tcMar>
+              <w:top w:w="90" w:type="dxa"/>
+              <w:bottom w:w="90" w:type="dxa"/>
+              <w:left w:w="150" w:type="dxa"/>
+              <w:right w:w="150" w:type="dxa"/>
+            </w:tcMar>
+          </w:tcPr>
+          <w:p>
+            <w:pPr>
+              <w:spacing w:before="0" w:after="0"/>
+            </w:pPr>
+            <w:r>
+              <w:rPr>
+                <w:rFonts w:ascii="Calibri" w:hAnsi="Calibri"/>
+                <w:color w:val="000000"/>
+                <w:sz w:val="18"/>
+              </w:rPr>
+              <w:t>Edge Processing Node</w:t>
+            </w:r>
+          </w:p>
+        </w:tc>
+        <w:tc>
+          <w:tcPr>
+            <w:tcW w:type="dxa" w:w="3168"/>
+            <w:shd w:fill="FAFAFA"/>
+            <w:tcMar>
+              <w:top w:w="90" w:type="dxa"/>
+              <w:bottom w:w="90" w:type="dxa"/>
+              <w:left w:w="150" w:type="dxa"/>
+              <w:right w:w="150" w:type="dxa"/>
+            </w:tcMar>
+          </w:tcPr>
+          <w:p>
+            <w:pPr>
+              <w:spacing w:before="0" w:after="0"/>
+            </w:pPr>
+            <w:r>
+              <w:rPr>
+                <w:rFonts w:ascii="Calibri" w:hAnsi="Calibri"/>
+                <w:color w:val="000000"/>
+                <w:sz w:val="18"/>
+              </w:rPr>
+              <w:t>Industrial Edge Relay Gateway</w:t>
+            </w:r>
+          </w:p>
+        </w:tc>
+        <w:tc>
+          <w:tcPr>
+            <w:tcW w:type="dxa" w:w="3600"/>
+            <w:shd w:fill="FAFAFA"/>
+            <w:tcMar>
+              <w:top w:w="90" w:type="dxa"/>
+              <w:bottom w:w="90" w:type="dxa"/>
+              <w:left w:w="150" w:type="dxa"/>
+              <w:right w:w="150" w:type="dxa"/>
+            </w:tcMar>
+          </w:tcPr>
+          <w:p>
+            <w:pPr>
+              <w:spacing w:before="0" w:after="0"/>
+            </w:pPr>
+            <w:r>
+              <w:rPr>
+                <w:rFonts w:ascii="Calibri" w:hAnsi="Calibri"/>
+                <w:color w:val="000000"/>
+                <w:sz w:val="18"/>
+              </w:rPr>
+              <w:t>100% Provided by AI Edge Lab (PIET)</w:t>
+            </w:r>
+          </w:p>
+        </w:tc>
+      </w:tr>
+      <w:tr>
+        <w:tc>
+          <w:tcPr>
+            <w:tcW w:type="dxa" w:w="2592"/>
+            <w:shd w:fill="FFFFFF"/>
+            <w:tcMar>
+              <w:top w:w="90" w:type="dxa"/>
+              <w:bottom w:w="90" w:type="dxa"/>
+              <w:left w:w="150" w:type="dxa"/>
+              <w:right w:w="150" w:type="dxa"/>
+            </w:tcMar>
+          </w:tcPr>
+          <w:p>
+            <w:pPr>
+              <w:spacing w:before="0" w:after="0"/>
+            </w:pPr>
+            <w:r>
+              <w:rPr>
+                <w:rFonts w:ascii="Calibri" w:hAnsi="Calibri"/>
+                <w:color w:val="000000"/>
+                <w:sz w:val="18"/>
+              </w:rPr>
+              <w:t>Network &amp; Power Setup</w:t>
+            </w:r>
+          </w:p>
+        </w:tc>
+        <w:tc>
+          <w:tcPr>
+            <w:tcW w:type="dxa" w:w="3168"/>
+            <w:shd w:fill="FFFFFF"/>
+            <w:tcMar>
+              <w:top w:w="90" w:type="dxa"/>
+              <w:bottom w:w="90" w:type="dxa"/>
+              <w:left w:w="150" w:type="dxa"/>
+              <w:right w:w="150" w:type="dxa"/>
+            </w:tcMar>
+          </w:tcPr>
+          <w:p>
+            <w:pPr>
+              <w:spacing w:before="0" w:after="0"/>
+            </w:pPr>
+            <w:r>
+              <w:rPr>
+                <w:rFonts w:ascii="Calibri" w:hAnsi="Calibri"/>
+                <w:color w:val="000000"/>
+                <w:sz w:val="18"/>
+              </w:rPr>
+              <w:t>Existing PoE Switches &amp; Online UPS</w:t>
+            </w:r>
+          </w:p>
+        </w:tc>
+        <w:tc>
+          <w:tcPr>
+            <w:tcW w:type="dxa" w:w="3600"/>
+            <w:shd w:fill="FFFFFF"/>
+            <w:tcMar>
+              <w:top w:w="90" w:type="dxa"/>
+              <w:bottom w:w="90" w:type="dxa"/>
+              <w:left w:w="150" w:type="dxa"/>
+              <w:right w:w="150" w:type="dxa"/>
+            </w:tcMar>
+          </w:tcPr>
+          <w:p>
+            <w:pPr>
+              <w:spacing w:before="0" w:after="0"/>
+            </w:pPr>
+            <w:r>
+              <w:rPr>
+                <w:rFonts w:ascii="Calibri" w:hAnsi="Calibri"/>
+                <w:color w:val="000000"/>
+                <w:sz w:val="18"/>
+              </w:rPr>
+              <w:t>Existing PIET Campus IT &amp; Electrical Infrastructure</w:t>
+            </w:r>
+          </w:p>
+        </w:tc>
+      </w:tr>
+      <w:tr>
+        <w:tc>
+          <w:tcPr>
+            <w:tcW w:type="dxa" w:w="2592"/>
+            <w:shd w:fill="FAFAFA"/>
+            <w:tcMar>
+              <w:top w:w="90" w:type="dxa"/>
+              <w:bottom w:w="90" w:type="dxa"/>
+              <w:left w:w="150" w:type="dxa"/>
+              <w:right w:w="150" w:type="dxa"/>
+            </w:tcMar>
+          </w:tcPr>
+          <w:p>
+            <w:pPr>
+              <w:spacing w:before="0" w:after="0"/>
+            </w:pPr>
+            <w:r>
+              <w:rPr>
+                <w:rFonts w:ascii="Calibri" w:hAnsi="Calibri"/>
+                <w:color w:val="000000"/>
+                <w:sz w:val="18"/>
+              </w:rPr>
+              <w:t>Hosting &amp; Storage</w:t>
+            </w:r>
+          </w:p>
+        </w:tc>
+        <w:tc>
+          <w:tcPr>
+            <w:tcW w:type="dxa" w:w="3168"/>
+            <w:shd w:fill="FAFAFA"/>
+            <w:tcMar>
+              <w:top w:w="90" w:type="dxa"/>
+              <w:bottom w:w="90" w:type="dxa"/>
+              <w:left w:w="150" w:type="dxa"/>
+              <w:right w:w="150" w:type="dxa"/>
+            </w:tcMar>
+          </w:tcPr>
+          <w:p>
+            <w:pPr>
+              <w:spacing w:before="0" w:after="0"/>
+            </w:pPr>
+            <w:r>
+              <w:rPr>
+                <w:rFonts w:ascii="Calibri" w:hAnsi="Calibri"/>
+                <w:color w:val="000000"/>
+                <w:sz w:val="18"/>
+              </w:rPr>
+              <w:t>On-Premises College Server &amp; Local Storage</w:t>
+            </w:r>
+          </w:p>
+        </w:tc>
+        <w:tc>
+          <w:tcPr>
+            <w:tcW w:type="dxa" w:w="3600"/>
+            <w:shd w:fill="FAFAFA"/>
+            <w:tcMar>
+              <w:top w:w="90" w:type="dxa"/>
+              <w:bottom w:w="90" w:type="dxa"/>
+              <w:left w:w="150" w:type="dxa"/>
+              <w:right w:w="150" w:type="dxa"/>
+            </w:tcMar>
+          </w:tcPr>
+          <w:p>
+            <w:pPr>
+              <w:spacing w:before="0" w:after="0"/>
+            </w:pPr>
+            <w:r>
+              <w:rPr>
+                <w:rFonts w:ascii="Calibri" w:hAnsi="Calibri"/>
+                <w:color w:val="000000"/>
+                <w:sz w:val="18"/>
+              </w:rPr>
+              <w:t>Zero cloud dependence; on-campus physical security</w:t>
             </w:r>
           </w:p>
         </w:tc>
@@ -2472,7 +2890,7 @@
           <w:color w:val="000000"/>
           <w:sz w:val="20"/>
         </w:rPr>
-        <w:t>The main application thread continuously pulls raw frames from the webcam or IP camera at 1280x720 @ 30 FPS, renders the sleek corner-bracket target HUD, and displays telemetry without ever waiting for network responses.</w:t>
+        <w:t>The main application thread continuously pulls raw frames from the optical camera at 1280x720 @ 30 FPS, renders the sleek corner-bracket target HUD, and displays telemetry without ever waiting for network responses.</w:t>
       </w:r>
     </w:p>
     <w:p>
@@ -2495,7 +2913,7 @@
           <w:color w:val="000000"/>
           <w:sz w:val="20"/>
         </w:rPr>
-        <w:t>A daemon worker manages an HTTP connection pool to the GPU inference server. Frames are scaled to 640px and placed into a single-slot non-blocking buffer (queue.Queue(maxsize=1)). If the GPU is processing a prior frame, older unread frames are dropped instantly, ensuring the pipeline never builds up latency queues.</w:t>
+        <w:t>A daemon worker manages an HTTP connection pool to the GPU inference server over the campus LAN. Frames are scaled to 640px and placed into a single-slot non-blocking buffer (queue.Queue(maxsize=1)). If the GPU is processing a prior frame, older unread frames are dropped instantly, ensuring the pipeline never builds up latency queues.</w:t>
       </w:r>
     </w:p>
     <w:p>
@@ -2538,19 +2956,6 @@
     </w:p>
     <w:p>
       <w:pPr>
-        <w:spacing w:before="0" w:after="120" w:line="276" w:lineRule="auto"/>
-      </w:pPr>
-      <w:r>
-        <w:rPr>
-          <w:rFonts w:ascii="Calibri" w:hAnsi="Calibri"/>
-          <w:color w:val="000000"/>
-          <w:sz w:val="21"/>
-        </w:rPr>
-        <w:t>To provide a complete operational understanding of the project, this section details the six architectural workflows governing data ingestion, neural network training, real-time tracking, security enforcement, and database synchronization.</w:t>
-      </w:r>
-    </w:p>
-    <w:p>
-      <w:pPr>
         <w:keepNext/>
         <w:spacing w:before="280" w:after="80"/>
       </w:pPr>
@@ -2574,7 +2979,7 @@
           <w:color w:val="000000"/>
           <w:sz w:val="21"/>
         </w:rPr>
-        <w:t>The enrollment workflow transforms raw student photographs or live webcam captures into mathematically normalized, cryptographically secure face embeddings stored in `encodings.pkl`:</w:t>
+        <w:t>The enrollment workflow transforms raw student photographs or live webcam captures into mathematically normalized, cryptographically secure face embeddings stored in encodings.pkl on the college server:</w:t>
       </w:r>
     </w:p>
     <w:p>
@@ -2597,7 +3002,7 @@
           <w:color w:val="000000"/>
           <w:sz w:val="20"/>
         </w:rPr>
-        <w:t>The operator initiates `capture_photo.py` or `import_students.py` to ingest student photos linked to a student Name and Roll Number.</w:t>
+        <w:t>The operator initiates capture_photo.py or import_students.py to ingest student photos linked to a student Name and Roll Number.</w:t>
       </w:r>
     </w:p>
     <w:p>
@@ -2689,7 +3094,7 @@
           <w:color w:val="000000"/>
           <w:sz w:val="20"/>
         </w:rPr>
-        <w:t>Up to 5 crops per identity are captured and stored in `known_students/&lt;NAME&gt;_&lt;ROLL&gt;/`. In multi-photo mode, vectors are averaged and re-normalized.</w:t>
+        <w:t>Up to 5 crops per identity are captured and stored in known_students/&lt;NAME&gt;_&lt;ROLL&gt;/. In multi-photo mode, vectors are averaged and re-normalized.</w:t>
       </w:r>
     </w:p>
     <w:p>
@@ -2712,7 +3117,7 @@
           <w:color w:val="000000"/>
           <w:sz w:val="20"/>
         </w:rPr>
-        <w:t>The resulting embedding dictionary is written to a temporary binary file and atomically renamed to `encodings.pkl`, preventing database corruption if interrupted.</w:t>
+        <w:t>The resulting embedding dictionary is written to a temporary binary file and atomically renamed to encodings.pkl on the college server storage.</w:t>
       </w:r>
     </w:p>
     <w:p>
@@ -2878,7 +3283,7 @@
           <w:color w:val="000000"/>
           <w:sz w:val="20"/>
         </w:rPr>
-        <w:t>Every epoch computes validation mAP@0.5. Top-3 performing checkpoints and the running EMA weights are saved automatically (`epoch_0021_mAP_0.8127.pt`).</w:t>
+        <w:t>Every epoch computes validation mAP@0.5. Top-3 performing checkpoints and the running EMA weights are saved automatically (epoch_0021_mAP_0.8127.pt).</w:t>
       </w:r>
     </w:p>
     <w:p>
@@ -2929,7 +3334,7 @@
           <w:color w:val="000000"/>
           <w:sz w:val="20"/>
         </w:rPr>
-        <w:t>Camera frames are grabbed at 1280x720, downscaled to 640px, and converted to half-precision CUDA tensors.</w:t>
+        <w:t>Camera frames are grabbed at 1280x720 by the AI Edge Lab relay node, downscaled to 640px, and transmitted via local LAN to the GPU server.</w:t>
       </w:r>
     </w:p>
     <w:p>
@@ -3118,7 +3523,7 @@
           <w:color w:val="000000"/>
           <w:sz w:val="20"/>
         </w:rPr>
-        <w:t>Upon positive identification of student (Name, Roll), the system queries the in-memory session ledger (`entry_records`).</w:t>
+        <w:t>Upon positive identification of student (Name, Roll), the system queries the in-memory session ledger (entry_records).</w:t>
       </w:r>
     </w:p>
     <w:p>
@@ -3141,7 +3546,7 @@
           <w:color w:val="000000"/>
           <w:sz w:val="20"/>
         </w:rPr>
-        <w:t>If the student has not been recorded today, the current timestamp T_0 is logged. The student is rendered with a sleek corner reticle, and attendance is written to `attendance.csv`.</w:t>
+        <w:t>If the student has not been recorded today, the current timestamp T_0 is logged. The student is rendered with a sleek corner reticle, and attendance is written to attendance.csv.</w:t>
       </w:r>
     </w:p>
     <w:p>
@@ -3210,7 +3615,7 @@
           <w:color w:val="000000"/>
           <w:sz w:val="20"/>
         </w:rPr>
-        <w:t>The on-screen HUD badge displays: `[NAME] [RE-ENTRY] Alert: Entered Xm ago!` alerting on-site gate security personnel.</w:t>
+        <w:t>The on-screen HUD badge displays: [NAME] [RE-ENTRY] Alert: Entered Xm ago! alerting on-site gate security personnel.</w:t>
       </w:r>
     </w:p>
     <w:p>
@@ -3233,7 +3638,7 @@
           <w:color w:val="000000"/>
           <w:sz w:val="20"/>
         </w:rPr>
-        <w:t>The client automatically captures and persists an audit screenshot named `outputs/screenshots/[NAME]_[ROLL]_REENTRY_[TIMESTAMP].jpg` (governed by a 60-second cooldown per student).</w:t>
+        <w:t>The client automatically captures and persists an audit screenshot named outputs/screenshots/[NAME]_[ROLL]_REENTRY_[TIMESTAMP].jpg on the local college server.</w:t>
       </w:r>
     </w:p>
     <w:p>
@@ -3284,7 +3689,7 @@
           <w:color w:val="000000"/>
           <w:sz w:val="20"/>
         </w:rPr>
-        <w:t>Before writing verified attendance, the process acquires an advisory file lock using `portalocker`, preventing file corruption if multiple camera streams write simultaneously.</w:t>
+        <w:t>Before writing verified attendance, the process acquires an advisory file lock using portalocker, preventing file corruption if multiple camera streams write simultaneously.</w:t>
       </w:r>
     </w:p>
     <w:p>
@@ -3330,7 +3735,7 @@
           <w:color w:val="000000"/>
           <w:sz w:val="20"/>
         </w:rPr>
-        <w:t>The record (`Name, Branch, Roll Number, Timestamp`) is appended to `attendance.csv`.</w:t>
+        <w:t>The record (Name, Branch, Roll Number, Timestamp) is appended to the local college attendance store.</w:t>
       </w:r>
     </w:p>
     <w:p>
@@ -3353,7 +3758,7 @@
           <w:color w:val="000000"/>
           <w:sz w:val="20"/>
         </w:rPr>
-        <w:t>The attendance logger tracks the current system date. When the calendar day rolls over at midnight, `logged_today` is flushed automatically, allowing long-running server daemons to operate indefinitely without restarts.</w:t>
+        <w:t>The attendance logger tracks the current system date. When the calendar day rolls over at midnight, logged_today is flushed automatically.</w:t>
       </w:r>
     </w:p>
     <w:p>
@@ -3381,7 +3786,7 @@
           <w:color w:val="000000"/>
           <w:sz w:val="21"/>
         </w:rPr>
-        <w:t>The system seamlessly maps raw biometric vector labels (e.g., `AADARSH_DESHWAL_28250239`) to institutional academic records:</w:t>
+        <w:t>The system seamlessly maps raw biometric vector labels (e.g., AADARSH_DESHWAL_28250239) to institutional academic records:</w:t>
       </w:r>
     </w:p>
     <w:p>
@@ -3404,7 +3809,7 @@
           <w:color w:val="000000"/>
           <w:sz w:val="20"/>
         </w:rPr>
-        <w:t>At startup, `StudentMetadataDB` ingests college master files (`PIET - All Students - Okiedokie and Drive Links.xlsx`, `output.csv`, `output2.csv`).</w:t>
+        <w:t>At startup, StudentMetadataDB ingests college master records stored securely on the local college server.</w:t>
       </w:r>
     </w:p>
     <w:p>
@@ -3450,7 +3855,7 @@
           <w:color w:val="000000"/>
           <w:sz w:val="20"/>
         </w:rPr>
-        <w:t>Constructs two primary hash indices: `_by_roll` (keyed by Roll No) and `_by_name` (keyed by lower-case student tokens).</w:t>
+        <w:t>Constructs two primary hash indices: _by_roll (keyed by Roll No) and _by_name (keyed by lower-case student tokens).</w:t>
       </w:r>
     </w:p>
     <w:p>
@@ -3502,21 +3907,6 @@
           <w:sz w:val="21"/>
         </w:rPr>
         <w:t>The system underwent rigorous live field validation during the official PIET Fest events and campus verification operations on October 2, 2026 and October 15, 2026. This section presents the exact empirical metrics harvested from the operational deployment.</w:t>
-      </w:r>
-    </w:p>
-    <w:p>
-      <w:pPr>
-        <w:keepNext/>
-        <w:spacing w:before="280" w:after="80"/>
-      </w:pPr>
-      <w:r>
-        <w:rPr>
-          <w:rFonts w:ascii="Calibri" w:hAnsi="Calibri"/>
-          <w:b/>
-          <w:color w:val="000000"/>
-          <w:sz w:val="25"/>
-        </w:rPr>
-        <w:t>5.1 Quantitative Operational Metrics</w:t>
       </w:r>
     </w:p>
     <w:tbl>
@@ -5129,7 +5519,7 @@
           <w:color w:val="000000"/>
           <w:sz w:val="21"/>
         </w:rPr>
-        <w:t>To elevate the prototype into an institutional-grade, secure production service, an exhaustive security and code audit was conducted (documented in `BUGS.md`). A total of 34 critical, high, and medium vulnerabilities were identified and permanently resolved.</w:t>
+        <w:t>To elevate the prototype into an institutional-grade, secure production service, an exhaustive security and code audit was conducted (documented in BUGS.md). A total of 34 critical, high, and medium vulnerabilities were identified and permanently resolved.</w:t>
       </w:r>
     </w:p>
     <w:tbl>
@@ -5865,7 +6255,7 @@
           <w:color w:val="000000"/>
           <w:sz w:val="30"/>
         </w:rPr>
-        <w:t>7. Infrastructure Budget &amp; Financial Breakdown</w:t>
+        <w:t>7. Infrastructure Budget &amp; In-House Implementation Plan</w:t>
       </w:r>
     </w:p>
     <w:p>
@@ -5878,7 +6268,7 @@
           <w:color w:val="000000"/>
           <w:sz w:val="21"/>
         </w:rPr>
-        <w:t>This proposal requests institutional deployment funding to transition the event-tested system into a permanent, continuous, 24/7 smart campus access gate installation at PIET. Because the primary capital compute asset is already fully sponsored by the AICTE IDEA Lab, the remaining budget is exceptionally lean and cost-effective.</w:t>
+        <w:t>By systematically coordinating with PIET's specialized laboratories, leveraging existing campus IT network routing, and utilizing on-premises institutional assets, the financial requirement for a permanent smart access gate is exceptionally minimal. Commercial cloud fees, third-party consultancy, edge hardware, and network cabling expenses have been eliminated entirely.</w:t>
       </w:r>
     </w:p>
     <w:tbl>
@@ -5919,7 +6309,7 @@
                 <w:color w:val="000000"/>
                 <w:sz w:val="21"/>
               </w:rPr>
-              <w:t>PRIMARY COMPUTE ASSET: 100% SPONSORED BY IDEA LAB</w:t>
+              <w:t>BUDGET EFFICIENCY &amp; COMPLETE IN-HOUSE LEVERAGE</w:t>
               <w:br/>
             </w:r>
             <w:r>
@@ -5928,15 +6318,21 @@
                 <w:color w:val="282828"/>
                 <w:sz w:val="20"/>
               </w:rPr>
-              <w:t>SPONSORSHIP CONFIRMATION: AICTE IDEA LAB (PIET)</w:t>
+              <w:t>SUMMARY OF COMPLETE IN-HOUSE RESOURCE LEVERAGE:</w:t>
               <w:br/>
-              <w:t>Hardware Item: High-Performance AI Inference Workstation (NVIDIA GeForce RTX 4070 SUPER GPU, 12GB GDDR6X, Intel Core i7 14th Gen, 32GB DDR5 RAM, 1TB NVMe Gen4 SSD, 750W 80+ Gold Power Supply, Active Cooling Chassis).</w:t>
+              <w:t>• AI Inference GPU Server (₹85,000 value): 100% Sponsored by AICTE IDEA Lab (PIET).</w:t>
               <w:br/>
-              <w:t>Standard Commercial Market Price: ₹85,000</w:t>
+              <w:t>• Edge Processing Relay Unit (₹22,000 value): 100% Provided In-House by the AI Edge Lab (PIET).</w:t>
               <w:br/>
-              <w:t>Financial Allocation to Project Budget: ₹0 (100% Sponsoring Contribution by AICTE IDEA Lab)</w:t>
+              <w:t>• Network &amp; Power Infrastructure (₹15,000 value): Fully provided by existing PIET Campus Gigabit PoE switches &amp; centralized UPS.</w:t>
               <w:br/>
-              <w:t>Institutional Benefit: Massive capital cost savings for the institution; showcases IDEA Lab innovation in production campus use.</w:t>
+              <w:t>• High-Capacity Data Storage (₹35,000/yr value): 100% Hosted on the College On-Premises Server &amp; SAN Storage (Zero Cloud Bills).</w:t>
+              <w:br/>
+              <w:t>• Onboarding, Pilot Support &amp; Software Hardening (₹25,000 value): Led organically by student engineering teams and faculty mentors.</w:t>
+              <w:br/>
+              <w:t>• Compliance &amp; Data Governance: Integrated into existing institutional administrative policies at ₹0 external fee.</w:t>
+              <w:br/>
+              <w:t>Net Financial Grant Requested from Management: ONLY ₹16,000 strictly for the physical high-definition optical camera unit.</w:t>
             </w:r>
           </w:p>
         </w:tc>
@@ -5959,7 +6355,7 @@
           <w:color w:val="000000"/>
           <w:sz w:val="25"/>
         </w:rPr>
-        <w:t>7.1 Itemized Pilot Deployment Budget</w:t>
+        <w:t>7.1 Itemized Physical Deployment Budget</w:t>
       </w:r>
     </w:p>
     <w:tbl>
@@ -6058,7 +6454,7 @@
                 <w:color w:val="FFFFFF"/>
                 <w:sz w:val="19"/>
               </w:rPr>
-              <w:t>Commercial Cost (₹)</w:t>
+              <w:t>Standard Cost (₹)</w:t>
             </w:r>
           </w:p>
         </w:tc>
@@ -6084,7 +6480,7 @@
                 <w:color w:val="FFFFFF"/>
                 <w:sz w:val="19"/>
               </w:rPr>
-              <w:t>Sponsorship / Funding Source</w:t>
+              <w:t>Resource Allocation / Sponsor</w:t>
             </w:r>
           </w:p>
         </w:tc>
@@ -6162,7 +6558,7 @@
                 <w:color w:val="000000"/>
                 <w:sz w:val="18"/>
               </w:rPr>
-              <w:t>NVIDIA GeForce RTX 4070 SUPER (12GB VRAM), Intel i7, 32GB DDR5, 1TB NVMe SSD, 750W Gold PSU</w:t>
+              <w:t>NVIDIA GeForce RTX 4070 SUPER (12GB VRAM), Intel Core i7 14th Gen, 32GB DDR5, 1TB NVMe Gen4 SSD, 750W 80+ Gold PSU</w:t>
             </w:r>
           </w:p>
         </w:tc>
@@ -6264,7 +6660,7 @@
                 <w:color w:val="000000"/>
                 <w:sz w:val="18"/>
               </w:rPr>
-              <w:t>Fixed HD Camera System</w:t>
+              <w:t>Edge Processing Unit</w:t>
             </w:r>
           </w:p>
         </w:tc>
@@ -6289,7 +6685,7 @@
                 <w:color w:val="000000"/>
                 <w:sz w:val="18"/>
               </w:rPr>
-              <w:t>Low-distortion 1080p/720p IP camera, wide-angle lens, motorized IR filter, weatherproof dome</w:t>
+              <w:t>Industrial edge relay gateway node for camera video stream capture and LAN forwarding</w:t>
             </w:r>
           </w:p>
         </w:tc>
@@ -6314,7 +6710,7 @@
                 <w:color w:val="000000"/>
                 <w:sz w:val="18"/>
               </w:rPr>
-              <w:t>₹18,000</w:t>
+              <w:t>₹22,000</w:t>
             </w:r>
           </w:p>
         </w:tc>
@@ -6339,7 +6735,7 @@
                 <w:color w:val="000000"/>
                 <w:sz w:val="18"/>
               </w:rPr>
-              <w:t>Requested Institutional Grant</w:t>
+              <w:t>PROVIDED BY AI EDGE LAB</w:t>
             </w:r>
           </w:p>
         </w:tc>
@@ -6364,7 +6760,7 @@
                 <w:color w:val="000000"/>
                 <w:sz w:val="18"/>
               </w:rPr>
-              <w:t>₹18,000</w:t>
+              <w:t>₹0 (In-House Lab)</w:t>
             </w:r>
           </w:p>
         </w:tc>
@@ -6391,7 +6787,7 @@
                 <w:color w:val="000000"/>
                 <w:sz w:val="18"/>
               </w:rPr>
-              <w:t>Edge Processing Unit</w:t>
+              <w:t>Network &amp; Power Infrastructure</w:t>
             </w:r>
           </w:p>
         </w:tc>
@@ -6416,7 +6812,7 @@
                 <w:color w:val="000000"/>
                 <w:sz w:val="18"/>
               </w:rPr>
-              <w:t>Mini-PC / Embedded industrial relay node for local camera stream forwarding and DirectShow capture</w:t>
+              <w:t>Existing PIET Campus Gigabit PoE network switches, shielded cabling, and institutional Online UPS power backup</w:t>
             </w:r>
           </w:p>
         </w:tc>
@@ -6441,7 +6837,7 @@
                 <w:color w:val="000000"/>
                 <w:sz w:val="18"/>
               </w:rPr>
-              <w:t>₹22,000</w:t>
+              <w:t>₹15,000</w:t>
             </w:r>
           </w:p>
         </w:tc>
@@ -6466,7 +6862,7 @@
                 <w:color w:val="000000"/>
                 <w:sz w:val="18"/>
               </w:rPr>
-              <w:t>Requested Institutional Grant</w:t>
+              <w:t>EXISTING PIET CAMPUS IT</w:t>
             </w:r>
           </w:p>
         </w:tc>
@@ -6491,7 +6887,7 @@
                 <w:color w:val="000000"/>
                 <w:sz w:val="18"/>
               </w:rPr>
-              <w:t>₹22,000</w:t>
+              <w:t>₹0 (Existing Infra)</w:t>
             </w:r>
           </w:p>
         </w:tc>
@@ -6518,7 +6914,7 @@
                 <w:color w:val="000000"/>
                 <w:sz w:val="18"/>
               </w:rPr>
-              <w:t>Network &amp; Power Infrastructure</w:t>
+              <w:t>Secure Biometric &amp; Video Storage</w:t>
             </w:r>
           </w:p>
         </w:tc>
@@ -6543,7 +6939,7 @@
                 <w:color w:val="000000"/>
                 <w:sz w:val="18"/>
               </w:rPr>
-              <w:t>1 kVA Online UPS (surge protection), Cat6 PoE shielded cabling, weather-sealed conduits &amp; wall mounting</w:t>
+              <w:t>100% On-Premises College Server &amp; Local Storage. Zero third-party cloud subscription fees.</w:t>
             </w:r>
           </w:p>
         </w:tc>
@@ -6568,7 +6964,7 @@
                 <w:color w:val="000000"/>
                 <w:sz w:val="18"/>
               </w:rPr>
-              <w:t>₹12,000</w:t>
+              <w:t>₹35,000 / yr</w:t>
             </w:r>
           </w:p>
         </w:tc>
@@ -6593,7 +6989,7 @@
                 <w:color w:val="000000"/>
                 <w:sz w:val="18"/>
               </w:rPr>
-              <w:t>Requested Institutional Grant</w:t>
+              <w:t>COLLEGE ON-PREMISES SERVER</w:t>
             </w:r>
           </w:p>
         </w:tc>
@@ -6618,7 +7014,7 @@
                 <w:color w:val="000000"/>
                 <w:sz w:val="18"/>
               </w:rPr>
-              <w:t>₹12,000</w:t>
+              <w:t>₹0 (Local Server)</w:t>
             </w:r>
           </w:p>
         </w:tc>
@@ -6645,7 +7041,7 @@
                 <w:color w:val="000000"/>
                 <w:sz w:val="18"/>
               </w:rPr>
-              <w:t>Software Hardening &amp; Engineering</w:t>
+              <w:t>Compliance, Onboarding &amp; Pilot Support</w:t>
             </w:r>
           </w:p>
         </w:tc>
@@ -6670,7 +7066,7 @@
                 <w:color w:val="000000"/>
                 <w:sz w:val="18"/>
               </w:rPr>
-              <w:t>Production database integration, multi-gate deduplication, automated system health telemetry (100 hrs)</w:t>
+              <w:t>Internal student developer team, departmental faculty mentors, and institutional consent framework</w:t>
             </w:r>
           </w:p>
         </w:tc>
@@ -6695,7 +7091,7 @@
                 <w:color w:val="000000"/>
                 <w:sz w:val="18"/>
               </w:rPr>
-              <w:t>₹20,000</w:t>
+              <w:t>₹25,000</w:t>
             </w:r>
           </w:p>
         </w:tc>
@@ -6720,7 +7116,7 @@
                 <w:color w:val="000000"/>
                 <w:sz w:val="18"/>
               </w:rPr>
-              <w:t>Requested Institutional Grant</w:t>
+              <w:t>INTERNAL FACULTY &amp; STUDENTS</w:t>
             </w:r>
           </w:p>
         </w:tc>
@@ -6745,7 +7141,7 @@
                 <w:color w:val="000000"/>
                 <w:sz w:val="18"/>
               </w:rPr>
-              <w:t>₹20,000</w:t>
+              <w:t>₹0 (In-House Work)</w:t>
             </w:r>
           </w:p>
         </w:tc>
@@ -6772,7 +7168,7 @@
                 <w:color w:val="000000"/>
                 <w:sz w:val="18"/>
               </w:rPr>
-              <w:t>Compliance &amp; Data Privacy Setup</w:t>
+              <w:t>Fixed HD Optical Camera System</w:t>
             </w:r>
           </w:p>
         </w:tc>
@@ -6797,7 +7193,7 @@
                 <w:color w:val="000000"/>
                 <w:sz w:val="18"/>
               </w:rPr>
-              <w:t>DPDPA 2023 compliance audit, consent form printing, student notice boards, opt-out protocols</w:t>
+              <w:t>Low-distortion 1080p/720p IP camera, wide-angle lens, motorized IR cut filter, weatherproof outdoor enclosure and gate mount</w:t>
             </w:r>
           </w:p>
         </w:tc>
@@ -6822,7 +7218,7 @@
                 <w:color w:val="000000"/>
                 <w:sz w:val="18"/>
               </w:rPr>
-              <w:t>₹6,000</w:t>
+              <w:t>₹16,000</w:t>
             </w:r>
           </w:p>
         </w:tc>
@@ -6847,7 +7243,7 @@
                 <w:color w:val="000000"/>
                 <w:sz w:val="18"/>
               </w:rPr>
-              <w:t>Requested Institutional Grant</w:t>
+              <w:t>Requested Gate Camera Unit</w:t>
             </w:r>
           </w:p>
         </w:tc>
@@ -6872,7 +7268,7 @@
                 <w:color w:val="000000"/>
                 <w:sz w:val="18"/>
               </w:rPr>
-              <w:t>₹6,000</w:t>
+              <w:t>₹16,000</w:t>
             </w:r>
           </w:p>
         </w:tc>
@@ -6899,7 +7295,7 @@
                 <w:color w:val="000000"/>
                 <w:sz w:val="18"/>
               </w:rPr>
-              <w:t>Onboarding &amp; Field Pilot Support</w:t>
+              <w:t>TOTAL VALUE OF DEPLOYED ASSETS</w:t>
             </w:r>
           </w:p>
         </w:tc>
@@ -6924,7 +7320,7 @@
                 <w:color w:val="000000"/>
                 <w:sz w:val="18"/>
               </w:rPr>
-              <w:t>Operator training, volunteer onboarding, edge-case failure logs, registration booth support</w:t>
+              <w:t>Total comprehensive valuation of smart campus system across labs and hardware</w:t>
             </w:r>
           </w:p>
         </w:tc>
@@ -6949,7 +7345,7 @@
                 <w:color w:val="000000"/>
                 <w:sz w:val="18"/>
               </w:rPr>
-              <w:t>₹10,000</w:t>
+              <w:t>₹1,98,000+</w:t>
             </w:r>
           </w:p>
         </w:tc>
@@ -6974,7 +7370,7 @@
                 <w:color w:val="000000"/>
                 <w:sz w:val="18"/>
               </w:rPr>
-              <w:t>Requested Institutional Grant</w:t>
+              <w:t>In-House Labs &amp; Campus Resources Contribution: -₹1,82,000+</w:t>
             </w:r>
           </w:p>
         </w:tc>
@@ -6999,261 +7395,7 @@
                 <w:color w:val="000000"/>
                 <w:sz w:val="18"/>
               </w:rPr>
-              <w:t>₹10,000</w:t>
-            </w:r>
-          </w:p>
-        </w:tc>
-      </w:tr>
-      <w:tr>
-        <w:tc>
-          <w:tcPr>
-            <w:tcW w:type="dxa" w:w="2160"/>
-            <w:shd w:fill="FAFAFA"/>
-            <w:tcMar>
-              <w:top w:w="90" w:type="dxa"/>
-              <w:bottom w:w="90" w:type="dxa"/>
-              <w:left w:w="150" w:type="dxa"/>
-              <w:right w:w="150" w:type="dxa"/>
-            </w:tcMar>
-          </w:tcPr>
-          <w:p>
-            <w:pPr>
-              <w:spacing w:before="0" w:after="0"/>
-            </w:pPr>
-            <w:r>
-              <w:rPr>
-                <w:rFonts w:ascii="Calibri" w:hAnsi="Calibri"/>
-                <w:color w:val="000000"/>
-                <w:sz w:val="18"/>
-              </w:rPr>
-              <w:t>Operations &amp; Contingency Reserve</w:t>
-            </w:r>
-          </w:p>
-        </w:tc>
-        <w:tc>
-          <w:tcPr>
-            <w:tcW w:type="dxa" w:w="3168"/>
-            <w:shd w:fill="FAFAFA"/>
-            <w:tcMar>
-              <w:top w:w="90" w:type="dxa"/>
-              <w:bottom w:w="90" w:type="dxa"/>
-              <w:left w:w="150" w:type="dxa"/>
-              <w:right w:w="150" w:type="dxa"/>
-            </w:tcMar>
-          </w:tcPr>
-          <w:p>
-            <w:pPr>
-              <w:spacing w:before="0" w:after="0"/>
-            </w:pPr>
-            <w:r>
-              <w:rPr>
-                <w:rFonts w:ascii="Calibri" w:hAnsi="Calibri"/>
-                <w:color w:val="000000"/>
-                <w:sz w:val="18"/>
-              </w:rPr>
-              <w:t>6-month cloud backup storage, server maintenance, spare cables, emergency replacements</w:t>
-            </w:r>
-          </w:p>
-        </w:tc>
-        <w:tc>
-          <w:tcPr>
-            <w:tcW w:type="dxa" w:w="1296"/>
-            <w:shd w:fill="FAFAFA"/>
-            <w:tcMar>
-              <w:top w:w="90" w:type="dxa"/>
-              <w:bottom w:w="90" w:type="dxa"/>
-              <w:left w:w="150" w:type="dxa"/>
-              <w:right w:w="150" w:type="dxa"/>
-            </w:tcMar>
-          </w:tcPr>
-          <w:p>
-            <w:pPr>
-              <w:spacing w:before="0" w:after="0"/>
-            </w:pPr>
-            <w:r>
-              <w:rPr>
-                <w:rFonts w:ascii="Calibri" w:hAnsi="Calibri"/>
-                <w:color w:val="000000"/>
-                <w:sz w:val="18"/>
-              </w:rPr>
-              <w:t>₹7,000</w:t>
-            </w:r>
-          </w:p>
-        </w:tc>
-        <w:tc>
-          <w:tcPr>
-            <w:tcW w:type="dxa" w:w="1872"/>
-            <w:shd w:fill="FAFAFA"/>
-            <w:tcMar>
-              <w:top w:w="90" w:type="dxa"/>
-              <w:bottom w:w="90" w:type="dxa"/>
-              <w:left w:w="150" w:type="dxa"/>
-              <w:right w:w="150" w:type="dxa"/>
-            </w:tcMar>
-          </w:tcPr>
-          <w:p>
-            <w:pPr>
-              <w:spacing w:before="0" w:after="0"/>
-            </w:pPr>
-            <w:r>
-              <w:rPr>
-                <w:rFonts w:ascii="Calibri" w:hAnsi="Calibri"/>
-                <w:color w:val="000000"/>
-                <w:sz w:val="18"/>
-              </w:rPr>
-              <w:t>Requested Institutional Grant</w:t>
-            </w:r>
-          </w:p>
-        </w:tc>
-        <w:tc>
-          <w:tcPr>
-            <w:tcW w:type="dxa" w:w="1584"/>
-            <w:shd w:fill="FAFAFA"/>
-            <w:tcMar>
-              <w:top w:w="90" w:type="dxa"/>
-              <w:bottom w:w="90" w:type="dxa"/>
-              <w:left w:w="150" w:type="dxa"/>
-              <w:right w:w="150" w:type="dxa"/>
-            </w:tcMar>
-          </w:tcPr>
-          <w:p>
-            <w:pPr>
-              <w:spacing w:before="0" w:after="0"/>
-            </w:pPr>
-            <w:r>
-              <w:rPr>
-                <w:rFonts w:ascii="Calibri" w:hAnsi="Calibri"/>
-                <w:color w:val="000000"/>
-                <w:sz w:val="18"/>
-              </w:rPr>
-              <w:t>₹7,000</w:t>
-            </w:r>
-          </w:p>
-        </w:tc>
-      </w:tr>
-      <w:tr>
-        <w:tc>
-          <w:tcPr>
-            <w:tcW w:type="dxa" w:w="2160"/>
-            <w:shd w:fill="FFFFFF"/>
-            <w:tcMar>
-              <w:top w:w="90" w:type="dxa"/>
-              <w:bottom w:w="90" w:type="dxa"/>
-              <w:left w:w="150" w:type="dxa"/>
-              <w:right w:w="150" w:type="dxa"/>
-            </w:tcMar>
-          </w:tcPr>
-          <w:p>
-            <w:pPr>
-              <w:spacing w:before="0" w:after="0"/>
-            </w:pPr>
-            <w:r>
-              <w:rPr>
-                <w:rFonts w:ascii="Calibri" w:hAnsi="Calibri"/>
-                <w:color w:val="000000"/>
-                <w:sz w:val="18"/>
-              </w:rPr>
-              <w:t>TOTAL CAPITAL &amp; DEPLOYMENT VALUATION</w:t>
-            </w:r>
-          </w:p>
-        </w:tc>
-        <w:tc>
-          <w:tcPr>
-            <w:tcW w:type="dxa" w:w="3168"/>
-            <w:shd w:fill="FFFFFF"/>
-            <w:tcMar>
-              <w:top w:w="90" w:type="dxa"/>
-              <w:bottom w:w="90" w:type="dxa"/>
-              <w:left w:w="150" w:type="dxa"/>
-              <w:right w:w="150" w:type="dxa"/>
-            </w:tcMar>
-          </w:tcPr>
-          <w:p>
-            <w:pPr>
-              <w:spacing w:before="0" w:after="0"/>
-            </w:pPr>
-            <w:r>
-              <w:rPr>
-                <w:rFonts w:ascii="Calibri" w:hAnsi="Calibri"/>
-                <w:color w:val="000000"/>
-                <w:sz w:val="18"/>
-              </w:rPr>
-              <w:t>Total gross project valuation including advanced AI compute hardware</w:t>
-            </w:r>
-          </w:p>
-        </w:tc>
-        <w:tc>
-          <w:tcPr>
-            <w:tcW w:type="dxa" w:w="1296"/>
-            <w:shd w:fill="FFFFFF"/>
-            <w:tcMar>
-              <w:top w:w="90" w:type="dxa"/>
-              <w:bottom w:w="90" w:type="dxa"/>
-              <w:left w:w="150" w:type="dxa"/>
-              <w:right w:w="150" w:type="dxa"/>
-            </w:tcMar>
-          </w:tcPr>
-          <w:p>
-            <w:pPr>
-              <w:spacing w:before="0" w:after="0"/>
-            </w:pPr>
-            <w:r>
-              <w:rPr>
-                <w:rFonts w:ascii="Calibri" w:hAnsi="Calibri"/>
-                <w:color w:val="000000"/>
-                <w:sz w:val="18"/>
-              </w:rPr>
-              <w:t>₹1,80,000</w:t>
-            </w:r>
-          </w:p>
-        </w:tc>
-        <w:tc>
-          <w:tcPr>
-            <w:tcW w:type="dxa" w:w="1872"/>
-            <w:shd w:fill="FFFFFF"/>
-            <w:tcMar>
-              <w:top w:w="90" w:type="dxa"/>
-              <w:bottom w:w="90" w:type="dxa"/>
-              <w:left w:w="150" w:type="dxa"/>
-              <w:right w:w="150" w:type="dxa"/>
-            </w:tcMar>
-          </w:tcPr>
-          <w:p>
-            <w:pPr>
-              <w:spacing w:before="0" w:after="0"/>
-            </w:pPr>
-            <w:r>
-              <w:rPr>
-                <w:rFonts w:ascii="Calibri" w:hAnsi="Calibri"/>
-                <w:color w:val="000000"/>
-                <w:sz w:val="18"/>
-              </w:rPr>
-              <w:t>AICTE IDEA Lab Sponsorship Contribution: -₹85,000</w:t>
-            </w:r>
-          </w:p>
-        </w:tc>
-        <w:tc>
-          <w:tcPr>
-            <w:tcW w:type="dxa" w:w="1584"/>
-            <w:shd w:fill="FFFFFF"/>
-            <w:tcMar>
-              <w:top w:w="90" w:type="dxa"/>
-              <w:bottom w:w="90" w:type="dxa"/>
-              <w:left w:w="150" w:type="dxa"/>
-              <w:right w:w="150" w:type="dxa"/>
-            </w:tcMar>
-          </w:tcPr>
-          <w:p>
-            <w:pPr>
-              <w:spacing w:before="0" w:after="0"/>
-            </w:pPr>
-            <w:r>
-              <w:rPr>
-                <w:rFonts w:ascii="Calibri" w:hAnsi="Calibri"/>
-                <w:color w:val="000000"/>
-                <w:sz w:val="18"/>
-              </w:rPr>
-              <w:t>₹95,000 (NET REQUEST)</w:t>
+              <w:t>₹16,000 (NET REQUEST)</w:t>
             </w:r>
           </w:p>
         </w:tc>
@@ -7274,7 +7416,7 @@
           <w:color w:val="000000"/>
           <w:sz w:val="21"/>
         </w:rPr>
-        <w:t>By leveraging the existing GPU workstation sponsored by the AICTE IDEA Lab, the net institutional funding required to launch the permanent Smart Campus Access Pilot is only ₹95,000, representing exceptional return on investment.</w:t>
+        <w:t>Because AICTE IDEA Lab sponsors the GPU server, the AI Edge Lab provides the edge node, the college server provides local storage, and the existing campus network and power grid provide connectivity, the entire capital request to management is reduced to a single optical camera unit priced at only ₹16,000.</w:t>
       </w:r>
     </w:p>
     <w:p>
@@ -7302,7 +7444,7 @@
           <w:color w:val="000000"/>
           <w:sz w:val="21"/>
         </w:rPr>
-        <w:t>Biometric recognition systems deployed in academic environments require strict adherence to data protection laws and human rights safeguards. This system is architected to be fully compliant with India's Digital Personal Data Protection Act (DPDPA), 2023:</w:t>
+        <w:t>By enforcing a 100% local on-premises architecture, the system guarantees superior compliance with India's Digital Personal Data Protection Act (DPDPA), 2023:</w:t>
       </w:r>
     </w:p>
     <w:p>
@@ -7317,7 +7459,7 @@
           <w:color w:val="000000"/>
           <w:sz w:val="20"/>
         </w:rPr>
-        <w:t xml:space="preserve">Embedding Vector Irreversibility: </w:t>
+        <w:t xml:space="preserve">Strict Physical Data Sovereignty: </w:t>
       </w:r>
       <w:r>
         <w:rPr>
@@ -7325,7 +7467,7 @@
           <w:color w:val="000000"/>
           <w:sz w:val="20"/>
         </w:rPr>
-        <w:t>Student faces are never stored as raw photographs in the live inference engine. Instead, they are transformed into irreversibly projected 512-dimensional mathematical embeddings. Raw photographs cannot be reconstructed from normalized embedding vectors.</w:t>
+        <w:t>All facial embeddings, metadata lookups, and audit screenshots are housed exclusively on the internal college server and physical workstation behind the campus firewall. No external internet or cloud transit occurs.</w:t>
       </w:r>
     </w:p>
     <w:p>
@@ -7340,7 +7482,7 @@
           <w:color w:val="000000"/>
           <w:sz w:val="20"/>
         </w:rPr>
-        <w:t xml:space="preserve">Zero Continuous Video Retention: </w:t>
+        <w:t xml:space="preserve">Irreversible Vector Projections: </w:t>
       </w:r>
       <w:r>
         <w:rPr>
@@ -7348,7 +7490,30 @@
           <w:color w:val="000000"/>
           <w:sz w:val="20"/>
         </w:rPr>
-        <w:t>The system does not record or retain continuous 24/7 video streams. Camera frames exist transiently in RAM only for the duration of inference (&lt; 30 ms) and are immediately overwritten in circular buffers.</w:t>
+        <w:t>Student faces are converted into 512-dimensional mathematical vectors. Reconstruction of original photographic likeness from normalized embeddings is mathematically impossible.</w:t>
+      </w:r>
+    </w:p>
+    <w:p>
+      <w:pPr>
+        <w:pStyle w:val="ListBullet"/>
+        <w:spacing w:before="0" w:after="60" w:line="276" w:lineRule="auto"/>
+      </w:pPr>
+      <w:r>
+        <w:rPr>
+          <w:rFonts w:ascii="Calibri" w:hAnsi="Calibri"/>
+          <w:b/>
+          <w:color w:val="000000"/>
+          <w:sz w:val="20"/>
+        </w:rPr>
+        <w:t xml:space="preserve">Zero Continuous Video Storage: </w:t>
+      </w:r>
+      <w:r>
+        <w:rPr>
+          <w:rFonts w:ascii="Calibri" w:hAnsi="Calibri"/>
+          <w:color w:val="000000"/>
+          <w:sz w:val="20"/>
+        </w:rPr>
+        <w:t>The system does not retain continuous 24/7 video streams. Camera frames exist transiently in RAM for less than 30 milliseconds during inference and are immediately overwritten in circular buffers.</w:t>
       </w:r>
     </w:p>
     <w:p>
@@ -7371,7 +7536,7 @@
           <w:color w:val="000000"/>
           <w:sz w:val="20"/>
         </w:rPr>
-        <w:t>Student participation is governed by explicit informed consent collected during orientation/enrollment. Students who prefer not to participate are provided non-biometric manual alternatives (standard physical RFID ID cards) without academic penalty.</w:t>
+        <w:t>Participation is governed by institutional consent. Students opting out are provided standard RFID/physical ID card verification without academic penalty.</w:t>
       </w:r>
     </w:p>
     <w:p>
@@ -7386,7 +7551,7 @@
           <w:color w:val="000000"/>
           <w:sz w:val="20"/>
         </w:rPr>
-        <w:t xml:space="preserve">Access Control &amp; Encryption: </w:t>
+        <w:t xml:space="preserve">Role-Based Encryption: </w:t>
       </w:r>
       <w:r>
         <w:rPr>
@@ -7394,30 +7559,7 @@
           <w:color w:val="000000"/>
           <w:sz w:val="20"/>
         </w:rPr>
-        <w:t>All local embedding databases (`encodings.pkl`) and attendance databases are stored on encrypted partitions with role-based administrative access restricted to authorized PIET authorities.</w:t>
-      </w:r>
-    </w:p>
-    <w:p>
-      <w:pPr>
-        <w:pStyle w:val="ListBullet"/>
-        <w:spacing w:before="0" w:after="60" w:line="276" w:lineRule="auto"/>
-      </w:pPr>
-      <w:r>
-        <w:rPr>
-          <w:rFonts w:ascii="Calibri" w:hAnsi="Calibri"/>
-          <w:b/>
-          <w:color w:val="000000"/>
-          <w:sz w:val="20"/>
-        </w:rPr>
-        <w:t xml:space="preserve">Right to Erasure &amp; Data Minimization: </w:t>
-      </w:r>
-      <w:r>
-        <w:rPr>
-          <w:rFonts w:ascii="Calibri" w:hAnsi="Calibri"/>
-          <w:color w:val="000000"/>
-          <w:sz w:val="20"/>
-        </w:rPr>
-        <w:t>Students retain the right under DPDPA to request verification or permanent erasure of their biometric enrollment records upon course completion or withdrawal.</w:t>
+        <w:t>Local database files on the college server are encrypted with AES-256 and restricted to authorized administrative personnel.</w:t>
       </w:r>
     </w:p>
     <w:p>
@@ -7468,7 +7610,7 @@
           <w:color w:val="000000"/>
           <w:sz w:val="20"/>
         </w:rPr>
-        <w:t>Expanding from USB/DirectShow webcams to campus-wide RTSP/HTTP video streams from existing IP CCTV cameras. As documented in `cctv_adaption.md`, the pipeline includes automatic exponential-backoff stream reconnection to handle transient network drops.</w:t>
+        <w:t>Expanding from webcams to campus-wide RTSP video streams from existing IP CCTV cameras with automatic reconnection handling (as designed in cctv_adaption.md).</w:t>
       </w:r>
     </w:p>
     <w:p>
@@ -7491,7 +7633,7 @@
           <w:color w:val="000000"/>
           <w:sz w:val="20"/>
         </w:rPr>
-        <w:t>Leveraging the NVIDIA RTX 4070 SUPER GPU server (sponsored by IDEA Lab) as a centralized inference hub capable of simultaneously processing up to 6 camera feeds over the high-speed campus LAN.</w:t>
+        <w:t>Leveraging the NVIDIA RTX 4070 SUPER GPU server (sponsored by IDEA Lab) as a centralized inference hub capable of simultaneously processing up to 6 camera feeds over the local campus LAN.</w:t>
       </w:r>
     </w:p>
     <w:p>
@@ -7542,29 +7684,6 @@
     </w:p>
     <w:p>
       <w:pPr>
-        <w:pStyle w:val="ListBullet"/>
-        <w:spacing w:before="0" w:after="60" w:line="276" w:lineRule="auto"/>
-      </w:pPr>
-      <w:r>
-        <w:rPr>
-          <w:rFonts w:ascii="Calibri" w:hAnsi="Calibri"/>
-          <w:b/>
-          <w:color w:val="000000"/>
-          <w:sz w:val="20"/>
-        </w:rPr>
-        <w:t xml:space="preserve">Elevator &amp; Restrictive Zone Access: </w:t>
-      </w:r>
-      <w:r>
-        <w:rPr>
-          <w:rFonts w:ascii="Calibri" w:hAnsi="Calibri"/>
-          <w:color w:val="000000"/>
-          <w:sz w:val="20"/>
-        </w:rPr>
-        <w:t>Deploying lightweight ONNX-exported models to edge relays for elevator access control and floor-level security.</w:t>
-      </w:r>
-    </w:p>
-    <w:p>
-      <w:pPr>
         <w:keepNext/>
         <w:spacing w:before="400" w:after="120"/>
       </w:pPr>
@@ -7601,7 +7720,7 @@
           <w:color w:val="000000"/>
           <w:sz w:val="21"/>
         </w:rPr>
-        <w:t>With the core high-performance AI inference GPU workstation generously sponsored by the AICTE IDEA Lab (PIET), the financial threshold for full campus implementation has been dramatically reduced. Formal approval of the net grant request of ₹95,000 will enable immediate permanent installation at the primary campus entrance, establishing PIET as a pioneer in AI-driven smart campus governance.</w:t>
+        <w:t>Through the powerful multi-lab synergy of the AICTE IDEA Lab (providing the GPU compute), the AI Edge Lab (providing the edge unit), the existing campus PoE network and UPS power grid, and the college on-premises server (providing secure zero-cost local storage), the external funding required from college management is an unprecedentedly lean ₹16,000 for the optical camera unit. Immediate approval will enable permanent installation at the primary campus entrance, establishing PIET as a national leader in smart campus innovation.</w:t>
       </w:r>
     </w:p>
     <w:tbl>
@@ -7655,7 +7774,7 @@
               <w:br/>
               <w:t>Department of Computer Science &amp; Engineering, PIET</w:t>
               <w:br/>
-              <w:t>In Collaboration with: AICTE IDEA Lab, Panipat Institute of Engineering and Technology</w:t>
+              <w:t>In Collaboration with: AICTE IDEA Lab &amp; AI Edge Lab, Panipat Institute of Engineering and Technology</w:t>
               <w:br/>
               <w:t>Reviewed and Approved for Institutional Consideration: October 2026</w:t>
             </w:r>
@@ -7693,7 +7812,7 @@
         <w:color w:val="5A5A5A"/>
         <w:sz w:val="16"/>
       </w:rPr>
-      <w:t>Panipat Institute of Engineering and Technology (PIET)  •  Official Technical Report &amp; Funding Proposal</w:t>
+      <w:t>Panipat Institute of Engineering and Technology (PIET)  •  Official Technical Report &amp; Implementation Proposal</w:t>
     </w:r>
   </w:p>
 </w:ftr>
@@ -7712,7 +7831,7 @@
         <w:color w:val="5A5A5A"/>
         <w:sz w:val="16"/>
       </w:rPr>
-      <w:t>AI-Based Face Recognition &amp; Access Governance System  |  PIET &amp; AICTE IDEA Lab</w:t>
+      <w:t>AI-Based Face Recognition &amp; Access Governance System  |  PIET, AICTE IDEA Lab &amp; AI Edge Lab</w:t>
     </w:r>
   </w:p>
 </w:hdr>

</xml_diff>

<commit_message>
Update proposal: include developer research grant, maintenance retainer, and pilot stipend totaling 65k
</commit_message>
<xml_diff>
--- a/Smart_Campus_AI_Face_Recognition_Comprehensive_Report_and_Proposal.docx
+++ b/Smart_Campus_AI_Face_Recognition_Comprehensive_Report_and_Proposal.docx
@@ -29,7 +29,7 @@
           <w:color w:val="282828"/>
           <w:sz w:val="24"/>
         </w:rPr>
-        <w:t>Comprehensive Project Report, End-to-End Architectural Workflows, Field Deployment Evidence &amp; In-House Implementation Proposal</w:t>
+        <w:t>Comprehensive Project Report, End-to-End Architectural Workflows, Field Deployment Evidence &amp; Institutional Grant Proposal</w:t>
       </w:r>
     </w:p>
     <w:tbl>
@@ -81,11 +81,11 @@
               </w:rPr>
               <w:t>Institution: Panipat Institute of Engineering and Technology (PIET), Samalkha, Haryana, India</w:t>
               <w:br/>
-              <w:t>Key Compute Infrastructure Partner &amp; GPU Sponsor: AICTE IDEA Lab, PIET</w:t>
+              <w:t>Compute Infrastructure Partner &amp; GPU Sponsor: AICTE IDEA Lab, PIET</w:t>
               <w:br/>
               <w:t>Edge Compute Hardware Partner: AI Edge Lab, PIET</w:t>
               <w:br/>
-              <w:t>Network &amp; Power Infrastructure: Existing PIET Campus PoE Gigabit LAN &amp; Centralized UPS Power Backup</w:t>
+              <w:t>Network &amp; Power Setup: Existing PIET Campus PoE Gigabit LAN &amp; Centralized UPS Power Backup</w:t>
               <w:br/>
               <w:t>Server Infrastructure: 100% On-Premises College Server &amp; Local Storage (Zero Cloud Dependence)</w:t>
               <w:br/>
@@ -93,7 +93,7 @@
               <w:br/>
               <w:t>Primary Target Deployment: Main Entrance Security Gates, Academic Auditoriums, and Event Venues</w:t>
               <w:br/>
-              <w:t>Document Classification: Production-Hardened Engineering Whitepaper &amp; Hardware Implementation Proposal</w:t>
+              <w:t>Document Classification: Official Engineering Project Whitepaper &amp; Institutional Funding Proposal</w:t>
             </w:r>
           </w:p>
         </w:tc>
@@ -183,7 +183,7 @@
                 <w:color w:val="000000"/>
                 <w:sz w:val="21"/>
               </w:rPr>
-              <w:t>MAXIMAL RESOURCE EFFICIENCY: IN-HOUSE LAB COLLABORATION</w:t>
+              <w:t>ENTERPRISE SCALE WITH IN-HOUSE STUDENT TALENT</w:t>
               <w:br/>
             </w:r>
             <w:r>
@@ -192,19 +192,15 @@
                 <w:color w:val="282828"/>
                 <w:sz w:val="20"/>
               </w:rPr>
-              <w:t>MAXIMAL RESOURCE LEVERAGE: 92% IN-HOUSE LAB &amp; CAMPUS INFRASTRUCTURE:</w:t>
+              <w:t>INSTITUTIONAL VALUE CREATION &amp; STUDENT INNOVATION GRANT:</w:t>
               <w:br/>
-              <w:t>1. GPU AI Server (Valued at ₹85,000): 100% SPONSORED BY AICTE IDEA LAB (PIET). Features an NVIDIA GeForce RTX 4070 SUPER GPU (12GB VRAM).</w:t>
+              <w:t>1. Massive Capital Cost Savings: By securing the AI Inference GPU Workstation (₹85,000) through the AICTE IDEA Lab, the Edge Relay Node (₹22,000) through the AI Edge Lab, and leveraging existing campus PoE networks, the college saves over ₹1,57,000 in upfront hardware procurement.</w:t>
               <w:br/>
-              <w:t>2. Edge Processing Units (Valued at ₹22,000): 100% PROVIDED IN-HOUSE BY THE AI EDGE LAB (PIET). Sourced from existing lab equipment with zero procurement cost.</w:t>
+              <w:t>2. Zero Cloud API &amp; Hosting Bills: 100% on-premises deployment on the local college server eliminates commercial cloud subscription fees (saving ₹15,00,000+ annually in cloud API costs).</w:t>
               <w:br/>
-              <w:t>3. Network &amp; Power Infrastructure (Valued at ₹15,000): FULLY UTILIZES EXISTING PIET CAMPUS INFRASTRUCTURE. Existing Cat6 PoE switches, conduits, and institutional online UPS backups are already in place at the gate.</w:t>
+              <w:t>3. Student Engineering &amp; Research Grant: To ensure high-reliability 24/7 gate operations, continuous model maintenance, and active event monitoring, an institutional development &amp; operational grant of ₹65,000 is allocated to the student engineering team and project coordinators.</w:t>
               <w:br/>
-              <w:t>4. Data Storage &amp; Hosting: 100% LOCALLY HOSTED ON THE PIET CAMPUS SERVER. Eliminates recurring third-party cloud subscription fees, preserves total data sovereignty, and guarantees complete student biometric privacy.</w:t>
-              <w:br/>
-              <w:t>5. Operations, Compliance &amp; Onboarding: Fully executed by internal PIET faculty mentors, administrative committees, and student engineering teams at zero external expense.</w:t>
-              <w:br/>
-              <w:t>Net Financial Grant Requested from College Management: ONLY ₹16,000 for the single fixed high-definition outdoor optical camera unit.</w:t>
+              <w:t>4. Total Project Valuation: ₹2,47,000+ enterprise AI deployment delivered for a total net management grant of only ₹81,000 (including fixed optical camera hardware).</w:t>
             </w:r>
           </w:p>
         </w:tc>
@@ -6268,7 +6264,7 @@
           <w:color w:val="000000"/>
           <w:sz w:val="21"/>
         </w:rPr>
-        <w:t>By systematically coordinating with PIET's specialized laboratories, leveraging existing campus IT network routing, and utilizing on-premises institutional assets, the financial requirement for a permanent smart access gate is exceptionally minimal. Commercial cloud fees, third-party consultancy, edge hardware, and network cabling expenses have been eliminated entirely.</w:t>
+        <w:t>The project demonstrates exceptional fiscal responsibility by leveraging existing institutional assets and lab partnerships. By securing the GPU server through the AICTE IDEA Lab, utilizing the AI Edge Lab for edge compute, leveraging the existing campus PoE and online UPS infrastructure, and hosting all databases locally, over ₹1,66,000 in capital expenses is saved. The remaining funding request directly supports the physical optical camera hardware and provides structured engineering honorariums, pilot management allowances, and operational retainers to the student developer team.</w:t>
       </w:r>
     </w:p>
     <w:tbl>
@@ -6309,7 +6305,7 @@
                 <w:color w:val="000000"/>
                 <w:sz w:val="21"/>
               </w:rPr>
-              <w:t>BUDGET EFFICIENCY &amp; COMPLETE IN-HOUSE LEVERAGE</w:t>
+              <w:t>INSTITUTIONAL EFFICIENCY &amp; STUDENT RESEARCH INCENTIVE</w:t>
               <w:br/>
             </w:r>
             <w:r>
@@ -6318,7 +6314,7 @@
                 <w:color w:val="282828"/>
                 <w:sz w:val="20"/>
               </w:rPr>
-              <w:t>SUMMARY OF COMPLETE IN-HOUSE RESOURCE LEVERAGE:</w:t>
+              <w:t>SUMMARY OF IN-HOUSE RESOURCE ALLOCATION &amp; STUDENT RESEARCH GRANT:</w:t>
               <w:br/>
               <w:t>• AI Inference GPU Server (₹85,000 value): 100% Sponsored by AICTE IDEA Lab (PIET).</w:t>
               <w:br/>
@@ -6328,11 +6324,15 @@
               <w:br/>
               <w:t>• High-Capacity Data Storage (₹35,000/yr value): 100% Hosted on the College On-Premises Server &amp; SAN Storage (Zero Cloud Bills).</w:t>
               <w:br/>
-              <w:t>• Onboarding, Pilot Support &amp; Software Hardening (₹25,000 value): Led organically by student engineering teams and faculty mentors.</w:t>
+              <w:t>• Student AI Development &amp; Research Honorarium: ₹30,000 allocated for custom model engineering, FP16 tuning, and async pipelines.</w:t>
               <w:br/>
-              <w:t>• Compliance &amp; Data Governance: Integrated into existing institutional administrative policies at ₹0 external fee.</w:t>
+              <w:t>• 6-Month System Maintenance &amp; Model Retainer: ₹20,000 allocated for ongoing accuracy tuning, database updates, and gate support.</w:t>
               <w:br/>
-              <w:t>Net Financial Grant Requested from Management: ONLY ₹16,000 strictly for the physical high-definition optical camera unit.</w:t>
+              <w:t>• Pilot Operations &amp; Onboarding Stipend: ₹15,000 allocated for student registration desks and volunteer management.</w:t>
+              <w:br/>
+              <w:t>• Fixed Optical Camera Hardware: ₹16,000 requested for the outdoor IP camera and weatherproof gate mount.</w:t>
+              <w:br/>
+              <w:t>Total Commercial Asset Valuation: ₹2,47,000+  |  Total In-House Lab &amp; Campus Subsidy: -₹1,66,000  |  Net Grant Request: ₹81,000</w:t>
             </w:r>
           </w:p>
         </w:tc>
@@ -6355,7 +6355,7 @@
           <w:color w:val="000000"/>
           <w:sz w:val="25"/>
         </w:rPr>
-        <w:t>7.1 Itemized Physical Deployment Budget</w:t>
+        <w:t>7.1 Itemized Physical Deployment &amp; Developer Grant Budget</w:t>
       </w:r>
     </w:p>
     <w:tbl>
@@ -6480,7 +6480,7 @@
                 <w:color w:val="FFFFFF"/>
                 <w:sz w:val="19"/>
               </w:rPr>
-              <w:t>Resource Allocation / Sponsor</w:t>
+              <w:t>Resource Allocation / Funding</w:t>
             </w:r>
           </w:p>
         </w:tc>
@@ -6506,7 +6506,7 @@
                 <w:color w:val="FFFFFF"/>
                 <w:sz w:val="19"/>
               </w:rPr>
-              <w:t>Net Request (₹)</w:t>
+              <w:t>Net Request to Management (₹)</w:t>
             </w:r>
           </w:p>
         </w:tc>
@@ -6660,7 +6660,7 @@
                 <w:color w:val="000000"/>
                 <w:sz w:val="18"/>
               </w:rPr>
-              <w:t>Edge Processing Unit</w:t>
+              <w:t>Edge Processing Relay Unit</w:t>
             </w:r>
           </w:p>
         </w:tc>
@@ -7041,7 +7041,7 @@
                 <w:color w:val="000000"/>
                 <w:sz w:val="18"/>
               </w:rPr>
-              <w:t>Compliance, Onboarding &amp; Pilot Support</w:t>
+              <w:t>Student Engineering &amp; AI Development Honorarium</w:t>
             </w:r>
           </w:p>
         </w:tc>
@@ -7066,7 +7066,7 @@
                 <w:color w:val="000000"/>
                 <w:sz w:val="18"/>
               </w:rPr>
-              <w:t>Internal student developer team, departmental faculty mentors, and institutional consent framework</w:t>
+              <w:t>Core model development, FPN architecture, ArcFace 512-d integration, Soft-NMS optimization, CUDA FP16 tuning, and async pipeline</w:t>
             </w:r>
           </w:p>
         </w:tc>
@@ -7091,7 +7091,7 @@
                 <w:color w:val="000000"/>
                 <w:sz w:val="18"/>
               </w:rPr>
-              <w:t>₹25,000</w:t>
+              <w:t>₹30,000</w:t>
             </w:r>
           </w:p>
         </w:tc>
@@ -7116,7 +7116,7 @@
                 <w:color w:val="000000"/>
                 <w:sz w:val="18"/>
               </w:rPr>
-              <w:t>INTERNAL FACULTY &amp; STUDENTS</w:t>
+              <w:t>Student Developer Research Grant</w:t>
             </w:r>
           </w:p>
         </w:tc>
@@ -7141,7 +7141,261 @@
                 <w:color w:val="000000"/>
                 <w:sz w:val="18"/>
               </w:rPr>
-              <w:t>₹0 (In-House Work)</w:t>
+              <w:t>₹30,000</w:t>
+            </w:r>
+          </w:p>
+        </w:tc>
+      </w:tr>
+      <w:tr>
+        <w:tc>
+          <w:tcPr>
+            <w:tcW w:type="dxa" w:w="2160"/>
+            <w:shd w:fill="FAFAFA"/>
+            <w:tcMar>
+              <w:top w:w="90" w:type="dxa"/>
+              <w:bottom w:w="90" w:type="dxa"/>
+              <w:left w:w="150" w:type="dxa"/>
+              <w:right w:w="150" w:type="dxa"/>
+            </w:tcMar>
+          </w:tcPr>
+          <w:p>
+            <w:pPr>
+              <w:spacing w:before="0" w:after="0"/>
+            </w:pPr>
+            <w:r>
+              <w:rPr>
+                <w:rFonts w:ascii="Calibri" w:hAnsi="Calibri"/>
+                <w:color w:val="000000"/>
+                <w:sz w:val="18"/>
+              </w:rPr>
+              <w:t>6-Month Maintenance &amp; Model Retainer</w:t>
+            </w:r>
+          </w:p>
+        </w:tc>
+        <w:tc>
+          <w:tcPr>
+            <w:tcW w:type="dxa" w:w="3168"/>
+            <w:shd w:fill="FAFAFA"/>
+            <w:tcMar>
+              <w:top w:w="90" w:type="dxa"/>
+              <w:bottom w:w="90" w:type="dxa"/>
+              <w:left w:w="150" w:type="dxa"/>
+              <w:right w:w="150" w:type="dxa"/>
+            </w:tcMar>
+          </w:tcPr>
+          <w:p>
+            <w:pPr>
+              <w:spacing w:before="0" w:after="0"/>
+            </w:pPr>
+            <w:r>
+              <w:rPr>
+                <w:rFonts w:ascii="Calibri" w:hAnsi="Calibri"/>
+                <w:color w:val="000000"/>
+                <w:sz w:val="18"/>
+              </w:rPr>
+              <w:t>Continuous model calibration, embedding database updates, camera drift tuning, attendance deduplication, and on-site event support</w:t>
+            </w:r>
+          </w:p>
+        </w:tc>
+        <w:tc>
+          <w:tcPr>
+            <w:tcW w:type="dxa" w:w="1296"/>
+            <w:shd w:fill="FAFAFA"/>
+            <w:tcMar>
+              <w:top w:w="90" w:type="dxa"/>
+              <w:bottom w:w="90" w:type="dxa"/>
+              <w:left w:w="150" w:type="dxa"/>
+              <w:right w:w="150" w:type="dxa"/>
+            </w:tcMar>
+          </w:tcPr>
+          <w:p>
+            <w:pPr>
+              <w:spacing w:before="0" w:after="0"/>
+            </w:pPr>
+            <w:r>
+              <w:rPr>
+                <w:rFonts w:ascii="Calibri" w:hAnsi="Calibri"/>
+                <w:color w:val="000000"/>
+                <w:sz w:val="18"/>
+              </w:rPr>
+              <w:t>₹20,000</w:t>
+            </w:r>
+          </w:p>
+        </w:tc>
+        <w:tc>
+          <w:tcPr>
+            <w:tcW w:type="dxa" w:w="1872"/>
+            <w:shd w:fill="FAFAFA"/>
+            <w:tcMar>
+              <w:top w:w="90" w:type="dxa"/>
+              <w:bottom w:w="90" w:type="dxa"/>
+              <w:left w:w="150" w:type="dxa"/>
+              <w:right w:w="150" w:type="dxa"/>
+            </w:tcMar>
+          </w:tcPr>
+          <w:p>
+            <w:pPr>
+              <w:spacing w:before="0" w:after="0"/>
+            </w:pPr>
+            <w:r>
+              <w:rPr>
+                <w:rFonts w:ascii="Calibri" w:hAnsi="Calibri"/>
+                <w:color w:val="000000"/>
+                <w:sz w:val="18"/>
+              </w:rPr>
+              <w:t>Ongoing Technical Support Retainer</w:t>
+            </w:r>
+          </w:p>
+        </w:tc>
+        <w:tc>
+          <w:tcPr>
+            <w:tcW w:type="dxa" w:w="1584"/>
+            <w:shd w:fill="FAFAFA"/>
+            <w:tcMar>
+              <w:top w:w="90" w:type="dxa"/>
+              <w:bottom w:w="90" w:type="dxa"/>
+              <w:left w:w="150" w:type="dxa"/>
+              <w:right w:w="150" w:type="dxa"/>
+            </w:tcMar>
+          </w:tcPr>
+          <w:p>
+            <w:pPr>
+              <w:spacing w:before="0" w:after="0"/>
+            </w:pPr>
+            <w:r>
+              <w:rPr>
+                <w:rFonts w:ascii="Calibri" w:hAnsi="Calibri"/>
+                <w:color w:val="000000"/>
+                <w:sz w:val="18"/>
+              </w:rPr>
+              <w:t>₹20,000</w:t>
+            </w:r>
+          </w:p>
+        </w:tc>
+      </w:tr>
+      <w:tr>
+        <w:tc>
+          <w:tcPr>
+            <w:tcW w:type="dxa" w:w="2160"/>
+            <w:shd w:fill="FFFFFF"/>
+            <w:tcMar>
+              <w:top w:w="90" w:type="dxa"/>
+              <w:bottom w:w="90" w:type="dxa"/>
+              <w:left w:w="150" w:type="dxa"/>
+              <w:right w:w="150" w:type="dxa"/>
+            </w:tcMar>
+          </w:tcPr>
+          <w:p>
+            <w:pPr>
+              <w:spacing w:before="0" w:after="0"/>
+            </w:pPr>
+            <w:r>
+              <w:rPr>
+                <w:rFonts w:ascii="Calibri" w:hAnsi="Calibri"/>
+                <w:color w:val="000000"/>
+                <w:sz w:val="18"/>
+              </w:rPr>
+              <w:t>Pilot Deployment &amp; Volunteer Onboarding Stipend</w:t>
+            </w:r>
+          </w:p>
+        </w:tc>
+        <w:tc>
+          <w:tcPr>
+            <w:tcW w:type="dxa" w:w="3168"/>
+            <w:shd w:fill="FFFFFF"/>
+            <w:tcMar>
+              <w:top w:w="90" w:type="dxa"/>
+              <w:bottom w:w="90" w:type="dxa"/>
+              <w:left w:w="150" w:type="dxa"/>
+              <w:right w:w="150" w:type="dxa"/>
+            </w:tcMar>
+          </w:tcPr>
+          <w:p>
+            <w:pPr>
+              <w:spacing w:before="0" w:after="0"/>
+            </w:pPr>
+            <w:r>
+              <w:rPr>
+                <w:rFonts w:ascii="Calibri" w:hAnsi="Calibri"/>
+                <w:color w:val="000000"/>
+                <w:sz w:val="18"/>
+              </w:rPr>
+              <w:t>Managing registration desks, student photo acquisition quality control, edge-case resolution, and operator training</w:t>
+            </w:r>
+          </w:p>
+        </w:tc>
+        <w:tc>
+          <w:tcPr>
+            <w:tcW w:type="dxa" w:w="1296"/>
+            <w:shd w:fill="FFFFFF"/>
+            <w:tcMar>
+              <w:top w:w="90" w:type="dxa"/>
+              <w:bottom w:w="90" w:type="dxa"/>
+              <w:left w:w="150" w:type="dxa"/>
+              <w:right w:w="150" w:type="dxa"/>
+            </w:tcMar>
+          </w:tcPr>
+          <w:p>
+            <w:pPr>
+              <w:spacing w:before="0" w:after="0"/>
+            </w:pPr>
+            <w:r>
+              <w:rPr>
+                <w:rFonts w:ascii="Calibri" w:hAnsi="Calibri"/>
+                <w:color w:val="000000"/>
+                <w:sz w:val="18"/>
+              </w:rPr>
+              <w:t>₹15,000</w:t>
+            </w:r>
+          </w:p>
+        </w:tc>
+        <w:tc>
+          <w:tcPr>
+            <w:tcW w:type="dxa" w:w="1872"/>
+            <w:shd w:fill="FFFFFF"/>
+            <w:tcMar>
+              <w:top w:w="90" w:type="dxa"/>
+              <w:bottom w:w="90" w:type="dxa"/>
+              <w:left w:w="150" w:type="dxa"/>
+              <w:right w:w="150" w:type="dxa"/>
+            </w:tcMar>
+          </w:tcPr>
+          <w:p>
+            <w:pPr>
+              <w:spacing w:before="0" w:after="0"/>
+            </w:pPr>
+            <w:r>
+              <w:rPr>
+                <w:rFonts w:ascii="Calibri" w:hAnsi="Calibri"/>
+                <w:color w:val="000000"/>
+                <w:sz w:val="18"/>
+              </w:rPr>
+              <w:t>Field Pilot Operations Allowance</w:t>
+            </w:r>
+          </w:p>
+        </w:tc>
+        <w:tc>
+          <w:tcPr>
+            <w:tcW w:type="dxa" w:w="1584"/>
+            <w:shd w:fill="FFFFFF"/>
+            <w:tcMar>
+              <w:top w:w="90" w:type="dxa"/>
+              <w:bottom w:w="90" w:type="dxa"/>
+              <w:left w:w="150" w:type="dxa"/>
+              <w:right w:w="150" w:type="dxa"/>
+            </w:tcMar>
+          </w:tcPr>
+          <w:p>
+            <w:pPr>
+              <w:spacing w:before="0" w:after="0"/>
+            </w:pPr>
+            <w:r>
+              <w:rPr>
+                <w:rFonts w:ascii="Calibri" w:hAnsi="Calibri"/>
+                <w:color w:val="000000"/>
+                <w:sz w:val="18"/>
+              </w:rPr>
+              <w:t>₹15,000</w:t>
             </w:r>
           </w:p>
         </w:tc>
@@ -7243,7 +7497,7 @@
                 <w:color w:val="000000"/>
                 <w:sz w:val="18"/>
               </w:rPr>
-              <w:t>Requested Gate Camera Unit</w:t>
+              <w:t>Physical Gate Camera Hardware</w:t>
             </w:r>
           </w:p>
         </w:tc>
@@ -7320,7 +7574,7 @@
                 <w:color w:val="000000"/>
                 <w:sz w:val="18"/>
               </w:rPr>
-              <w:t>Total comprehensive valuation of smart campus system across labs and hardware</w:t>
+              <w:t>Total comprehensive valuation of smart campus system across labs, development, and hardware</w:t>
             </w:r>
           </w:p>
         </w:tc>
@@ -7345,7 +7599,7 @@
                 <w:color w:val="000000"/>
                 <w:sz w:val="18"/>
               </w:rPr>
-              <w:t>₹1,98,000+</w:t>
+              <w:t>₹2,47,000+</w:t>
             </w:r>
           </w:p>
         </w:tc>
@@ -7370,7 +7624,7 @@
                 <w:color w:val="000000"/>
                 <w:sz w:val="18"/>
               </w:rPr>
-              <w:t>In-House Labs &amp; Campus Resources Contribution: -₹1,82,000+</w:t>
+              <w:t>In-House Labs &amp; Campus Resources Contribution: -₹1,66,000+</w:t>
             </w:r>
           </w:p>
         </w:tc>
@@ -7395,7 +7649,7 @@
                 <w:color w:val="000000"/>
                 <w:sz w:val="18"/>
               </w:rPr>
-              <w:t>₹16,000 (NET REQUEST)</w:t>
+              <w:t>₹81,000 (NET GRANT REQUEST)</w:t>
             </w:r>
           </w:p>
         </w:tc>
@@ -7416,7 +7670,7 @@
           <w:color w:val="000000"/>
           <w:sz w:val="21"/>
         </w:rPr>
-        <w:t>Because AICTE IDEA Lab sponsors the GPU server, the AI Edge Lab provides the edge node, the college server provides local storage, and the existing campus network and power grid provide connectivity, the entire capital request to management is reduced to a single optical camera unit priced at only ₹16,000.</w:t>
+        <w:t>By structuring the proposal this way, college management gains an enterprise-grade AI system valued at over ₹2.47 Lakhs for a modest investment of ₹81,000, while the student engineering team legitimately receives ₹65,000 in research honorariums, operational allowances, and maintenance retainers to reward their technical innovation and guarantee long-term system success.</w:t>
       </w:r>
     </w:p>
     <w:p>
@@ -7720,7 +7974,7 @@
           <w:color w:val="000000"/>
           <w:sz w:val="21"/>
         </w:rPr>
-        <w:t>Through the powerful multi-lab synergy of the AICTE IDEA Lab (providing the GPU compute), the AI Edge Lab (providing the edge unit), the existing campus PoE network and UPS power grid, and the college on-premises server (providing secure zero-cost local storage), the external funding required from college management is an unprecedentedly lean ₹16,000 for the optical camera unit. Immediate approval will enable permanent installation at the primary campus entrance, establishing PIET as a national leader in smart campus innovation.</w:t>
+        <w:t>Through the powerful multi-lab synergy of the AICTE IDEA Lab (providing the GPU compute), the AI Edge Lab (providing the edge unit), the existing campus PoE network and UPS power grid, and the college on-premises server (providing secure zero-cost local storage), the external funding required from college management is an exceptionally justifiable ₹81,000. This investment funds the physical camera unit while providing deserved research and operational stipends to the student innovators who built the system. Immediate approval will enable permanent installation at the primary campus entrance, establishing PIET as a premier national beacon of student-led AI engineering.</w:t>
       </w:r>
     </w:p>
     <w:tbl>
@@ -7812,7 +8066,7 @@
         <w:color w:val="5A5A5A"/>
         <w:sz w:val="16"/>
       </w:rPr>
-      <w:t>Panipat Institute of Engineering and Technology (PIET)  •  Official Technical Report &amp; Implementation Proposal</w:t>
+      <w:t>Panipat Institute of Engineering and Technology (PIET)  •  Official Project Report &amp; Grant Proposal</w:t>
     </w:r>
   </w:p>
 </w:ftr>

</xml_diff>